<commit_message>
Updated frontend UI, added chatbot, auth, dashboard, updated docs
</commit_message>
<xml_diff>
--- a/docs/CREDITPATH AI-REPORT.docx
+++ b/docs/CREDITPATH AI-REPORT.docx
@@ -2314,41 +2314,13 @@
           <w:szCs w:val="28"/>
         </w:rPr>
       </w:pPr>
-      <w:proofErr w:type="spellStart"/>
-      <w:r>
-        <w:rPr>
-          <w:rFonts w:ascii="Times New Roman" w:hAnsi="Times New Roman" w:cs="Times New Roman"/>
-          <w:sz w:val="28"/>
-          <w:szCs w:val="28"/>
-        </w:rPr>
-        <w:t>CreditPath</w:t>
-      </w:r>
-      <w:proofErr w:type="spellEnd"/>
-      <w:r>
-        <w:rPr>
-          <w:rFonts w:ascii="Times New Roman" w:hAnsi="Times New Roman" w:cs="Times New Roman"/>
-          <w:sz w:val="28"/>
-          <w:szCs w:val="28"/>
-        </w:rPr>
-        <w:t xml:space="preserve"> AI is an intelligent loan risk prediction and decision-support system designed to assist both borrowers and financial institutions in making accurate and efficient financial decisions. In the modern financial landscape, evaluating the creditworthiness of individuals is a critical task, as incorrect loan approvals can lead to significant financial losses for banks and long-term financial instability for borrowers. This project addresses these challenges by developing an automated system that </w:t>
-      </w:r>
-      <w:proofErr w:type="spellStart"/>
-      <w:r>
-        <w:rPr>
-          <w:rFonts w:ascii="Times New Roman" w:hAnsi="Times New Roman" w:cs="Times New Roman"/>
-          <w:sz w:val="28"/>
-          <w:szCs w:val="28"/>
-        </w:rPr>
-        <w:t>analyzes</w:t>
-      </w:r>
-      <w:proofErr w:type="spellEnd"/>
-      <w:r>
-        <w:rPr>
-          <w:rFonts w:ascii="Times New Roman" w:hAnsi="Times New Roman" w:cs="Times New Roman"/>
-          <w:sz w:val="28"/>
-          <w:szCs w:val="28"/>
-        </w:rPr>
-        <w:t xml:space="preserve"> key financial parameters and provides reliable predictions along with meaningful recommendations.</w:t>
+      <w:r>
+        <w:rPr>
+          <w:rFonts w:ascii="Times New Roman" w:hAnsi="Times New Roman" w:cs="Times New Roman"/>
+          <w:sz w:val="28"/>
+          <w:szCs w:val="28"/>
+        </w:rPr>
+        <w:t>CreditPath AI is an intelligent loan risk prediction and decision-support system designed to assist both borrowers and financial institutions in making accurate and efficient financial decisions. In the modern financial landscape, evaluating the creditworthiness of individuals is a critical task, as incorrect loan approvals can lead to significant financial losses for banks and long-term financial instability for borrowers. This project addresses these challenges by developing an automated system that analyzes key financial parameters and provides reliable predictions along with meaningful recommendations.</w:t>
       </w:r>
     </w:p>
     <w:p>
@@ -2402,61 +2374,25 @@
           <w:sz w:val="28"/>
           <w:szCs w:val="28"/>
         </w:rPr>
-        <w:t xml:space="preserve">The backend of the system is implemented using </w:t>
-      </w:r>
-      <w:proofErr w:type="spellStart"/>
-      <w:r>
-        <w:rPr>
-          <w:rFonts w:ascii="Times New Roman" w:hAnsi="Times New Roman" w:cs="Times New Roman"/>
-          <w:sz w:val="28"/>
-          <w:szCs w:val="28"/>
-        </w:rPr>
-        <w:t>FastAPI</w:t>
-      </w:r>
-      <w:proofErr w:type="spellEnd"/>
-      <w:r>
-        <w:rPr>
-          <w:rFonts w:ascii="Times New Roman" w:hAnsi="Times New Roman" w:cs="Times New Roman"/>
-          <w:sz w:val="28"/>
-          <w:szCs w:val="28"/>
-        </w:rPr>
-        <w:t>, ensuring efficient API-based communication and real-time data processing, while the frontend is developed using React to provide an interactive and user-friendly interface. The system also incorporates data visualization techniques such as pie charts, bar graphs, and semi-circular charts to present results in a clear and understandable manner.</w:t>
-      </w:r>
-    </w:p>
-    <w:p>
-      <w:pPr>
-        <w:jc w:val="both"/>
-        <w:rPr>
-          <w:rFonts w:ascii="Times New Roman" w:hAnsi="Times New Roman" w:cs="Times New Roman"/>
-          <w:sz w:val="28"/>
-          <w:szCs w:val="28"/>
-        </w:rPr>
-      </w:pPr>
-      <w:r>
-        <w:rPr>
-          <w:rFonts w:ascii="Times New Roman" w:hAnsi="Times New Roman" w:cs="Times New Roman"/>
-          <w:sz w:val="28"/>
-          <w:szCs w:val="28"/>
-        </w:rPr>
-        <w:t xml:space="preserve">Overall, </w:t>
-      </w:r>
-      <w:proofErr w:type="spellStart"/>
-      <w:r>
-        <w:rPr>
-          <w:rFonts w:ascii="Times New Roman" w:hAnsi="Times New Roman" w:cs="Times New Roman"/>
-          <w:sz w:val="28"/>
-          <w:szCs w:val="28"/>
-        </w:rPr>
-        <w:t>CreditPath</w:t>
-      </w:r>
-      <w:proofErr w:type="spellEnd"/>
-      <w:r>
-        <w:rPr>
-          <w:rFonts w:ascii="Times New Roman" w:hAnsi="Times New Roman" w:cs="Times New Roman"/>
-          <w:sz w:val="28"/>
-          <w:szCs w:val="28"/>
-        </w:rPr>
-        <w:t xml:space="preserve"> AI demonstrates the effective application of intelligent systems in the financial domain, improving accuracy, efficiency, and transparency in loan risk assessment while providing a scalable solution for real-world applications.</w:t>
+        <w:t>The backend of the system is implemented using FastAPI, ensuring efficient API-based communication and real-time data processing, while the frontend is developed using React to provide an interactive and user-friendly interface. The system also incorporates data visualization techniques such as pie charts, bar graphs, and semi-circular charts to present results in a clear and understandable manner.</w:t>
+      </w:r>
+    </w:p>
+    <w:p>
+      <w:pPr>
+        <w:jc w:val="both"/>
+        <w:rPr>
+          <w:rFonts w:ascii="Times New Roman" w:hAnsi="Times New Roman" w:cs="Times New Roman"/>
+          <w:sz w:val="28"/>
+          <w:szCs w:val="28"/>
+        </w:rPr>
+      </w:pPr>
+      <w:r>
+        <w:rPr>
+          <w:rFonts w:ascii="Times New Roman" w:hAnsi="Times New Roman" w:cs="Times New Roman"/>
+          <w:sz w:val="28"/>
+          <w:szCs w:val="28"/>
+        </w:rPr>
+        <w:t>Overall, CreditPath AI demonstrates the effective application of intelligent systems in the financial domain, improving accuracy, efficiency, and transparency in loan risk assessment while providing a scalable solution for real-world applications.</w:t>
       </w:r>
     </w:p>
     <w:p>
@@ -2572,25 +2508,7 @@
           <w:sz w:val="28"/>
           <w:szCs w:val="28"/>
         </w:rPr>
-        <w:t xml:space="preserve">In the modern financial ecosystem, loan systems play a vital role in supporting individuals and businesses by providing access to credit. Banks and financial institutions rely on various financial indicators such as income, credit history, and repayment </w:t>
-      </w:r>
-      <w:proofErr w:type="spellStart"/>
-      <w:r>
-        <w:rPr>
-          <w:rFonts w:ascii="Times New Roman" w:hAnsi="Times New Roman" w:cs="Times New Roman"/>
-          <w:sz w:val="28"/>
-          <w:szCs w:val="28"/>
-        </w:rPr>
-        <w:t>behavior</w:t>
-      </w:r>
-      <w:proofErr w:type="spellEnd"/>
-      <w:r>
-        <w:rPr>
-          <w:rFonts w:ascii="Times New Roman" w:hAnsi="Times New Roman" w:cs="Times New Roman"/>
-          <w:sz w:val="28"/>
-          <w:szCs w:val="28"/>
-        </w:rPr>
-        <w:t xml:space="preserve"> to evaluate whether a borrower is capable of repaying a loan. This process, known as credit risk assessment, is crucial for maintaining the stability of financial institutions.</w:t>
+        <w:t>In the modern financial ecosystem, loan systems play a vital role in supporting individuals and businesses by providing access to credit. Banks and financial institutions rely on various financial indicators such as income, credit history, and repayment behavior to evaluate whether a borrower is capable of repaying a loan. This process, known as credit risk assessment, is crucial for maintaining the stability of financial institutions.</w:t>
       </w:r>
     </w:p>
     <w:p>
@@ -2626,61 +2544,25 @@
           <w:sz w:val="28"/>
           <w:szCs w:val="28"/>
         </w:rPr>
-        <w:t xml:space="preserve">Traditional loan evaluation systems often depend on manual processes or simple rule-based methods. These approaches may not always capture the complexity of financial data and can lead to inconsistent results. With the advancement of technology, there is an increasing need for automated systems that can </w:t>
-      </w:r>
-      <w:proofErr w:type="spellStart"/>
-      <w:r>
-        <w:rPr>
-          <w:rFonts w:ascii="Times New Roman" w:hAnsi="Times New Roman" w:cs="Times New Roman"/>
-          <w:sz w:val="28"/>
-          <w:szCs w:val="28"/>
-        </w:rPr>
-        <w:t>analyze</w:t>
-      </w:r>
-      <w:proofErr w:type="spellEnd"/>
-      <w:r>
-        <w:rPr>
-          <w:rFonts w:ascii="Times New Roman" w:hAnsi="Times New Roman" w:cs="Times New Roman"/>
-          <w:sz w:val="28"/>
-          <w:szCs w:val="28"/>
-        </w:rPr>
-        <w:t xml:space="preserve"> financial data efficiently and provide accurate risk predictions.</w:t>
-      </w:r>
-    </w:p>
-    <w:p>
-      <w:pPr>
-        <w:jc w:val="both"/>
-        <w:rPr>
-          <w:rFonts w:ascii="Times New Roman" w:hAnsi="Times New Roman" w:cs="Times New Roman"/>
-          <w:sz w:val="28"/>
-          <w:szCs w:val="28"/>
-        </w:rPr>
-      </w:pPr>
-      <w:r>
-        <w:rPr>
-          <w:rFonts w:ascii="Times New Roman" w:hAnsi="Times New Roman" w:cs="Times New Roman"/>
-          <w:sz w:val="28"/>
-          <w:szCs w:val="28"/>
-        </w:rPr>
-        <w:t xml:space="preserve">The development of intelligent systems using modern technologies allows for better analysis of financial parameters and supports decision-making through data-driven insights. </w:t>
-      </w:r>
-      <w:proofErr w:type="spellStart"/>
-      <w:r>
-        <w:rPr>
-          <w:rFonts w:ascii="Times New Roman" w:hAnsi="Times New Roman" w:cs="Times New Roman"/>
-          <w:sz w:val="28"/>
-          <w:szCs w:val="28"/>
-        </w:rPr>
-        <w:t>CreditPath</w:t>
-      </w:r>
-      <w:proofErr w:type="spellEnd"/>
-      <w:r>
-        <w:rPr>
-          <w:rFonts w:ascii="Times New Roman" w:hAnsi="Times New Roman" w:cs="Times New Roman"/>
-          <w:sz w:val="28"/>
-          <w:szCs w:val="28"/>
-        </w:rPr>
-        <w:t xml:space="preserve"> AI is designed in this context to provide a structured and efficient solution for loan risk prediction.</w:t>
+        <w:t>Traditional loan evaluation systems often depend on manual processes or simple rule-based methods. These approaches may not always capture the complexity of financial data and can lead to inconsistent results. With the advancement of technology, there is an increasing need for automated systems that can analyze financial data efficiently and provide accurate risk predictions.</w:t>
+      </w:r>
+    </w:p>
+    <w:p>
+      <w:pPr>
+        <w:jc w:val="both"/>
+        <w:rPr>
+          <w:rFonts w:ascii="Times New Roman" w:hAnsi="Times New Roman" w:cs="Times New Roman"/>
+          <w:sz w:val="28"/>
+          <w:szCs w:val="28"/>
+        </w:rPr>
+      </w:pPr>
+      <w:r>
+        <w:rPr>
+          <w:rFonts w:ascii="Times New Roman" w:hAnsi="Times New Roman" w:cs="Times New Roman"/>
+          <w:sz w:val="28"/>
+          <w:szCs w:val="28"/>
+        </w:rPr>
+        <w:t>The development of intelligent systems using modern technologies allows for better analysis of financial parameters and supports decision-making through data-driven insights. CreditPath AI is designed in this context to provide a structured and efficient solution for loan risk prediction.</w:t>
       </w:r>
     </w:p>
     <w:p>
@@ -2877,25 +2759,7 @@
           <w:sz w:val="28"/>
           <w:szCs w:val="28"/>
         </w:rPr>
-        <w:t xml:space="preserve">The primary objective of the </w:t>
-      </w:r>
-      <w:proofErr w:type="spellStart"/>
-      <w:r>
-        <w:rPr>
-          <w:rFonts w:ascii="Times New Roman" w:hAnsi="Times New Roman" w:cs="Times New Roman"/>
-          <w:sz w:val="28"/>
-          <w:szCs w:val="28"/>
-        </w:rPr>
-        <w:t>CreditPath</w:t>
-      </w:r>
-      <w:proofErr w:type="spellEnd"/>
-      <w:r>
-        <w:rPr>
-          <w:rFonts w:ascii="Times New Roman" w:hAnsi="Times New Roman" w:cs="Times New Roman"/>
-          <w:sz w:val="28"/>
-          <w:szCs w:val="28"/>
-        </w:rPr>
-        <w:t xml:space="preserve"> AI project is to develop an intelligent system that enhances the process of loan risk evaluation and decision-making.</w:t>
+        <w:t>The primary objective of the CreditPath AI project is to develop an intelligent system that enhances the process of loan risk evaluation and decision-making.</w:t>
       </w:r>
     </w:p>
     <w:p>
@@ -2935,25 +2799,7 @@
           <w:sz w:val="28"/>
           <w:szCs w:val="28"/>
         </w:rPr>
-        <w:t xml:space="preserve">To </w:t>
-      </w:r>
-      <w:proofErr w:type="spellStart"/>
-      <w:r>
-        <w:rPr>
-          <w:rFonts w:ascii="Times New Roman" w:hAnsi="Times New Roman" w:cs="Times New Roman"/>
-          <w:sz w:val="28"/>
-          <w:szCs w:val="28"/>
-        </w:rPr>
-        <w:t>analyze</w:t>
-      </w:r>
-      <w:proofErr w:type="spellEnd"/>
-      <w:r>
-        <w:rPr>
-          <w:rFonts w:ascii="Times New Roman" w:hAnsi="Times New Roman" w:cs="Times New Roman"/>
-          <w:sz w:val="28"/>
-          <w:szCs w:val="28"/>
-        </w:rPr>
-        <w:t xml:space="preserve"> financial inputs such as income, credit score, and loan details </w:t>
+        <w:t xml:space="preserve">To analyze financial inputs such as income, credit score, and loan details </w:t>
       </w:r>
     </w:p>
     <w:p>
@@ -3163,25 +3009,7 @@
           <w:sz w:val="28"/>
           <w:szCs w:val="28"/>
         </w:rPr>
-        <w:t xml:space="preserve">The scope of </w:t>
-      </w:r>
-      <w:proofErr w:type="spellStart"/>
-      <w:r>
-        <w:rPr>
-          <w:rFonts w:ascii="Times New Roman" w:hAnsi="Times New Roman" w:cs="Times New Roman"/>
-          <w:sz w:val="28"/>
-          <w:szCs w:val="28"/>
-        </w:rPr>
-        <w:t>CreditPath</w:t>
-      </w:r>
-      <w:proofErr w:type="spellEnd"/>
-      <w:r>
-        <w:rPr>
-          <w:rFonts w:ascii="Times New Roman" w:hAnsi="Times New Roman" w:cs="Times New Roman"/>
-          <w:sz w:val="28"/>
-          <w:szCs w:val="28"/>
-        </w:rPr>
-        <w:t xml:space="preserve"> AI is focused on developing a functional and efficient system for loan risk prediction using predefined financial parameters. The system is designed to work with basic inputs such as income, credit score, loan amount, and repayment history, which are commonly used in financial assessments.</w:t>
+        <w:t>The scope of CreditPath AI is focused on developing a functional and efficient system for loan risk prediction using predefined financial parameters. The system is designed to work with basic inputs such as income, credit score, loan amount, and repayment history, which are commonly used in financial assessments.</w:t>
       </w:r>
     </w:p>
     <w:p>
@@ -3308,43 +3136,7 @@
           <w:sz w:val="28"/>
           <w:szCs w:val="28"/>
         </w:rPr>
-        <w:t xml:space="preserve">To overcome the limitations of traditional loan evaluation systems, </w:t>
-      </w:r>
-      <w:proofErr w:type="spellStart"/>
-      <w:r>
-        <w:rPr>
-          <w:rFonts w:ascii="Times New Roman" w:hAnsi="Times New Roman" w:cs="Times New Roman"/>
-          <w:sz w:val="28"/>
-          <w:szCs w:val="28"/>
-        </w:rPr>
-        <w:t>CreditPath</w:t>
-      </w:r>
-      <w:proofErr w:type="spellEnd"/>
-      <w:r>
-        <w:rPr>
-          <w:rFonts w:ascii="Times New Roman" w:hAnsi="Times New Roman" w:cs="Times New Roman"/>
-          <w:sz w:val="28"/>
-          <w:szCs w:val="28"/>
-        </w:rPr>
-        <w:t xml:space="preserve"> AI provides an automated and intelligent solution for loan risk prediction and decision support. The system collects key financial inputs such as income, credit score, loan amount, and repayment history, and processes them using backend logic developed with </w:t>
-      </w:r>
-      <w:proofErr w:type="spellStart"/>
-      <w:r>
-        <w:rPr>
-          <w:rFonts w:ascii="Times New Roman" w:hAnsi="Times New Roman" w:cs="Times New Roman"/>
-          <w:sz w:val="28"/>
-          <w:szCs w:val="28"/>
-        </w:rPr>
-        <w:t>FastAPI</w:t>
-      </w:r>
-      <w:proofErr w:type="spellEnd"/>
-      <w:r>
-        <w:rPr>
-          <w:rFonts w:ascii="Times New Roman" w:hAnsi="Times New Roman" w:cs="Times New Roman"/>
-          <w:sz w:val="28"/>
-          <w:szCs w:val="28"/>
-        </w:rPr>
-        <w:t xml:space="preserve"> to evaluate borrower risk.</w:t>
+        <w:t>To overcome the limitations of traditional loan evaluation systems, CreditPath AI provides an automated and intelligent solution for loan risk prediction and decision support. The system collects key financial inputs such as income, credit score, loan amount, and repayment history, and processes them using backend logic developed with FastAPI to evaluate borrower risk.</w:t>
       </w:r>
     </w:p>
     <w:p>
@@ -3416,25 +3208,7 @@
           <w:sz w:val="28"/>
           <w:szCs w:val="28"/>
         </w:rPr>
-        <w:t xml:space="preserve">With a React-based frontend, the system ensures an interactive and user-friendly experience, enabling real-time input, prediction, and visualization. Overall, </w:t>
-      </w:r>
-      <w:proofErr w:type="spellStart"/>
-      <w:r>
-        <w:rPr>
-          <w:rFonts w:ascii="Times New Roman" w:hAnsi="Times New Roman" w:cs="Times New Roman"/>
-          <w:sz w:val="28"/>
-          <w:szCs w:val="28"/>
-        </w:rPr>
-        <w:t>CreditPath</w:t>
-      </w:r>
-      <w:proofErr w:type="spellEnd"/>
-      <w:r>
-        <w:rPr>
-          <w:rFonts w:ascii="Times New Roman" w:hAnsi="Times New Roman" w:cs="Times New Roman"/>
-          <w:sz w:val="28"/>
-          <w:szCs w:val="28"/>
-        </w:rPr>
-        <w:t xml:space="preserve"> AI provides an efficient, accurate, and scalable solution for modern loan risk assessment.</w:t>
+        <w:t>With a React-based frontend, the system ensures an interactive and user-friendly experience, enabling real-time input, prediction, and visualization. Overall, CreditPath AI provides an efficient, accurate, and scalable solution for modern loan risk assessment.</w:t>
       </w:r>
     </w:p>
     <w:p>
@@ -3522,25 +3296,7 @@
           <w:sz w:val="28"/>
           <w:szCs w:val="28"/>
         </w:rPr>
-        <w:t xml:space="preserve">The main objective of </w:t>
-      </w:r>
-      <w:proofErr w:type="spellStart"/>
-      <w:r>
-        <w:rPr>
-          <w:rFonts w:ascii="Times New Roman" w:hAnsi="Times New Roman" w:cs="Times New Roman"/>
-          <w:sz w:val="28"/>
-          <w:szCs w:val="28"/>
-        </w:rPr>
-        <w:t>CreditPath</w:t>
-      </w:r>
-      <w:proofErr w:type="spellEnd"/>
-      <w:r>
-        <w:rPr>
-          <w:rFonts w:ascii="Times New Roman" w:hAnsi="Times New Roman" w:cs="Times New Roman"/>
-          <w:sz w:val="28"/>
-          <w:szCs w:val="28"/>
-        </w:rPr>
-        <w:t xml:space="preserve"> AI is to create a unified platform that:</w:t>
+        <w:t>The main objective of CreditPath AI is to create a unified platform that:</w:t>
       </w:r>
       <w:r>
         <w:rPr>
@@ -3626,25 +3382,7 @@
           <w:sz w:val="28"/>
           <w:szCs w:val="28"/>
         </w:rPr>
-        <w:t xml:space="preserve">The architecture of </w:t>
-      </w:r>
-      <w:proofErr w:type="spellStart"/>
-      <w:r>
-        <w:rPr>
-          <w:rFonts w:ascii="Times New Roman" w:hAnsi="Times New Roman" w:cs="Times New Roman"/>
-          <w:sz w:val="28"/>
-          <w:szCs w:val="28"/>
-        </w:rPr>
-        <w:t>CreditPath</w:t>
-      </w:r>
-      <w:proofErr w:type="spellEnd"/>
-      <w:r>
-        <w:rPr>
-          <w:rFonts w:ascii="Times New Roman" w:hAnsi="Times New Roman" w:cs="Times New Roman"/>
-          <w:sz w:val="28"/>
-          <w:szCs w:val="28"/>
-        </w:rPr>
-        <w:t xml:space="preserve"> AI is designed using a layered approach to ensure smooth interaction between different components of the system. It consists of three main layers: the frontend layer, the backend layer, and the logic layer. Each layer plays a specific role in processing data and generating meaningful outputs.</w:t>
+        <w:t>The architecture of CreditPath AI is designed using a layered approach to ensure smooth interaction between different components of the system. It consists of three main layers: the frontend layer, the backend layer, and the logic layer. Each layer plays a specific role in processing data and generating meaningful outputs.</w:t>
       </w:r>
     </w:p>
     <w:p>
@@ -3754,65 +3492,25 @@
           <w:sz w:val="28"/>
           <w:szCs w:val="28"/>
         </w:rPr>
-        <w:t xml:space="preserve"> (</w:t>
-      </w:r>
-      <w:proofErr w:type="spellStart"/>
-      <w:r>
-        <w:rPr>
-          <w:rFonts w:ascii="Times New Roman" w:hAnsi="Times New Roman" w:cs="Times New Roman"/>
-          <w:b/>
-          <w:bCs/>
-          <w:sz w:val="28"/>
-          <w:szCs w:val="28"/>
-        </w:rPr>
-        <w:t>FastAPI</w:t>
-      </w:r>
-      <w:proofErr w:type="spellEnd"/>
-      <w:r>
-        <w:rPr>
-          <w:rFonts w:ascii="Times New Roman" w:hAnsi="Times New Roman" w:cs="Times New Roman"/>
-          <w:b/>
-          <w:bCs/>
-          <w:sz w:val="28"/>
-          <w:szCs w:val="28"/>
-        </w:rPr>
-        <w:t>)</w:t>
-      </w:r>
-    </w:p>
-    <w:p>
-      <w:pPr>
-        <w:jc w:val="both"/>
-        <w:rPr>
-          <w:rFonts w:ascii="Times New Roman" w:hAnsi="Times New Roman" w:cs="Times New Roman"/>
-          <w:sz w:val="28"/>
-          <w:szCs w:val="28"/>
-        </w:rPr>
-      </w:pPr>
-      <w:r>
-        <w:rPr>
-          <w:rFonts w:ascii="Times New Roman" w:hAnsi="Times New Roman" w:cs="Times New Roman"/>
-          <w:sz w:val="28"/>
-          <w:szCs w:val="28"/>
-        </w:rPr>
-        <w:t xml:space="preserve">The backend layer is implemented using </w:t>
-      </w:r>
-      <w:proofErr w:type="spellStart"/>
-      <w:r>
-        <w:rPr>
-          <w:rFonts w:ascii="Times New Roman" w:hAnsi="Times New Roman" w:cs="Times New Roman"/>
-          <w:sz w:val="28"/>
-          <w:szCs w:val="28"/>
-        </w:rPr>
-        <w:t>FastAPI</w:t>
-      </w:r>
-      <w:proofErr w:type="spellEnd"/>
-      <w:r>
-        <w:rPr>
-          <w:rFonts w:ascii="Times New Roman" w:hAnsi="Times New Roman" w:cs="Times New Roman"/>
-          <w:sz w:val="28"/>
-          <w:szCs w:val="28"/>
-        </w:rPr>
-        <w:t xml:space="preserve"> and acts as the core processing unit of the system. It receives input data from the frontend in the form of API requests and processes it using predefined logic. This layer ensures efficient handling of requests and provides real-time responses.</w:t>
+        <w:t xml:space="preserve"> (FastAPI)</w:t>
+      </w:r>
+    </w:p>
+    <w:p>
+      <w:pPr>
+        <w:jc w:val="both"/>
+        <w:rPr>
+          <w:rFonts w:ascii="Times New Roman" w:hAnsi="Times New Roman" w:cs="Times New Roman"/>
+          <w:sz w:val="28"/>
+          <w:szCs w:val="28"/>
+        </w:rPr>
+      </w:pPr>
+      <w:r>
+        <w:rPr>
+          <w:rFonts w:ascii="Times New Roman" w:hAnsi="Times New Roman" w:cs="Times New Roman"/>
+          <w:sz w:val="28"/>
+          <w:szCs w:val="28"/>
+        </w:rPr>
+        <w:t>The backend layer is implemented using FastAPI and acts as the core processing unit of the system. It receives input data from the frontend in the form of API requests and processes it using predefined logic. This layer ensures efficient handling of requests and provides real-time responses.</w:t>
       </w:r>
     </w:p>
     <w:p>
@@ -4057,25 +3755,7 @@
           <w:sz w:val="28"/>
           <w:szCs w:val="28"/>
         </w:rPr>
-        <w:t xml:space="preserve">The workflow of </w:t>
-      </w:r>
-      <w:proofErr w:type="spellStart"/>
-      <w:r>
-        <w:rPr>
-          <w:rFonts w:ascii="Times New Roman" w:hAnsi="Times New Roman" w:cs="Times New Roman"/>
-          <w:sz w:val="28"/>
-          <w:szCs w:val="28"/>
-        </w:rPr>
-        <w:t>CreditPath</w:t>
-      </w:r>
-      <w:proofErr w:type="spellEnd"/>
-      <w:r>
-        <w:rPr>
-          <w:rFonts w:ascii="Times New Roman" w:hAnsi="Times New Roman" w:cs="Times New Roman"/>
-          <w:sz w:val="28"/>
-          <w:szCs w:val="28"/>
-        </w:rPr>
-        <w:t xml:space="preserve"> AI describes the step-by-step process through which the system operates, from data input to final output. The process ensures smooth data flow and accurate prediction of results.</w:t>
+        <w:t>The workflow of CreditPath AI describes the step-by-step process through which the system operates, from data input to final output. The process ensures smooth data flow and accurate prediction of results.</w:t>
       </w:r>
     </w:p>
     <w:p>
@@ -4235,25 +3915,7 @@
           <w:sz w:val="28"/>
           <w:szCs w:val="28"/>
         </w:rPr>
-        <w:t xml:space="preserve">The logic layer </w:t>
-      </w:r>
-      <w:proofErr w:type="spellStart"/>
-      <w:r>
-        <w:rPr>
-          <w:rFonts w:ascii="Times New Roman" w:hAnsi="Times New Roman" w:cs="Times New Roman"/>
-          <w:sz w:val="28"/>
-          <w:szCs w:val="28"/>
-        </w:rPr>
-        <w:t>analyzes</w:t>
-      </w:r>
-      <w:proofErr w:type="spellEnd"/>
-      <w:r>
-        <w:rPr>
-          <w:rFonts w:ascii="Times New Roman" w:hAnsi="Times New Roman" w:cs="Times New Roman"/>
-          <w:sz w:val="28"/>
-          <w:szCs w:val="28"/>
-        </w:rPr>
-        <w:t xml:space="preserve"> the input parameters and calculates the risk level for users or the default probability for banks. This step involves applying predefined conditions and rules to determine the outcome.</w:t>
+        <w:t>The logic layer analyzes the input parameters and calculates the risk level for users or the default probability for banks. This step involves applying predefined conditions and rules to determine the outcome.</w:t>
       </w:r>
     </w:p>
     <w:p>
@@ -4638,25 +4300,7 @@
           <w:sz w:val="28"/>
           <w:szCs w:val="28"/>
         </w:rPr>
-        <w:t xml:space="preserve">The user module is designed to evaluate the financial condition of the borrower and provide meaningful insights. It accepts inputs such as loan type, income, credit score, loan amount, and missed payments through the frontend interface. Based on these inputs, the system </w:t>
-      </w:r>
-      <w:proofErr w:type="spellStart"/>
-      <w:r>
-        <w:rPr>
-          <w:rFonts w:ascii="Times New Roman" w:hAnsi="Times New Roman" w:cs="Times New Roman"/>
-          <w:sz w:val="28"/>
-          <w:szCs w:val="28"/>
-        </w:rPr>
-        <w:t>analyzes</w:t>
-      </w:r>
-      <w:proofErr w:type="spellEnd"/>
-      <w:r>
-        <w:rPr>
-          <w:rFonts w:ascii="Times New Roman" w:hAnsi="Times New Roman" w:cs="Times New Roman"/>
-          <w:sz w:val="28"/>
-          <w:szCs w:val="28"/>
-        </w:rPr>
-        <w:t xml:space="preserve"> the borrower’s financial profile and determines their creditworthiness.</w:t>
+        <w:t>The user module is designed to evaluate the financial condition of the borrower and provide meaningful insights. It accepts inputs such as loan type, income, credit score, loan amount, and missed payments through the frontend interface. Based on these inputs, the system analyzes the borrower’s financial profile and determines their creditworthiness.</w:t>
       </w:r>
     </w:p>
     <w:p>
@@ -4915,25 +4559,7 @@
           <w:sz w:val="28"/>
           <w:szCs w:val="28"/>
         </w:rPr>
-        <w:t xml:space="preserve">The bank module focuses on </w:t>
-      </w:r>
-      <w:proofErr w:type="spellStart"/>
-      <w:r>
-        <w:rPr>
-          <w:rFonts w:ascii="Times New Roman" w:hAnsi="Times New Roman" w:cs="Times New Roman"/>
-          <w:sz w:val="28"/>
-          <w:szCs w:val="28"/>
-        </w:rPr>
-        <w:t>analyzing</w:t>
-      </w:r>
-      <w:proofErr w:type="spellEnd"/>
-      <w:r>
-        <w:rPr>
-          <w:rFonts w:ascii="Times New Roman" w:hAnsi="Times New Roman" w:cs="Times New Roman"/>
-          <w:sz w:val="28"/>
-          <w:szCs w:val="28"/>
-        </w:rPr>
-        <w:t xml:space="preserve"> the borrower’s profile from the perspective of financial institutions. It uses inputs such as loan amount, income, credit score, loan-to-value ratio (LTV), and debt-to-income ratio (DTI) to evaluate the level of risk associated with a loan application.</w:t>
+        <w:t>The bank module focuses on analyzing the borrower’s profile from the perspective of financial institutions. It uses inputs such as loan amount, income, credit score, loan-to-value ratio (LTV), and debt-to-income ratio (DTI) to evaluate the level of risk associated with a loan application.</w:t>
       </w:r>
     </w:p>
     <w:p>
@@ -4996,23 +4622,13 @@
           <w:szCs w:val="28"/>
         </w:rPr>
       </w:pPr>
-      <w:proofErr w:type="spellStart"/>
-      <w:r>
-        <w:rPr>
-          <w:rFonts w:ascii="Times New Roman" w:hAnsi="Times New Roman" w:cs="Times New Roman"/>
-          <w:sz w:val="28"/>
-          <w:szCs w:val="28"/>
-        </w:rPr>
-        <w:t>Analyzes</w:t>
-      </w:r>
-      <w:proofErr w:type="spellEnd"/>
-      <w:r>
-        <w:rPr>
-          <w:rFonts w:ascii="Times New Roman" w:hAnsi="Times New Roman" w:cs="Times New Roman"/>
-          <w:sz w:val="28"/>
-          <w:szCs w:val="28"/>
-        </w:rPr>
-        <w:t xml:space="preserve"> borrower profile </w:t>
+      <w:r>
+        <w:rPr>
+          <w:rFonts w:ascii="Times New Roman" w:hAnsi="Times New Roman" w:cs="Times New Roman"/>
+          <w:sz w:val="28"/>
+          <w:szCs w:val="28"/>
+        </w:rPr>
+        <w:t xml:space="preserve">Analyzes borrower profile </w:t>
       </w:r>
     </w:p>
     <w:p>
@@ -5144,23 +4760,13 @@
           <w:szCs w:val="28"/>
         </w:rPr>
       </w:pPr>
-      <w:proofErr w:type="spellStart"/>
-      <w:r>
-        <w:rPr>
-          <w:rFonts w:ascii="Times New Roman" w:hAnsi="Times New Roman" w:cs="Times New Roman"/>
-          <w:sz w:val="28"/>
-          <w:szCs w:val="28"/>
-        </w:rPr>
-        <w:t>Decidion</w:t>
-      </w:r>
-      <w:proofErr w:type="spellEnd"/>
-      <w:r>
-        <w:rPr>
-          <w:rFonts w:ascii="Times New Roman" w:hAnsi="Times New Roman" w:cs="Times New Roman"/>
-          <w:sz w:val="28"/>
-          <w:szCs w:val="28"/>
-        </w:rPr>
-        <w:t xml:space="preserve"> Strategy</w:t>
+      <w:r>
+        <w:rPr>
+          <w:rFonts w:ascii="Times New Roman" w:hAnsi="Times New Roman" w:cs="Times New Roman"/>
+          <w:sz w:val="28"/>
+          <w:szCs w:val="28"/>
+        </w:rPr>
+        <w:t>Decidion Strategy</w:t>
       </w:r>
     </w:p>
     <w:p>
@@ -6058,25 +5664,7 @@
           <w:sz w:val="28"/>
           <w:szCs w:val="28"/>
         </w:rPr>
-        <w:t xml:space="preserve">The implementation of </w:t>
-      </w:r>
-      <w:proofErr w:type="spellStart"/>
-      <w:r>
-        <w:rPr>
-          <w:rFonts w:ascii="Times New Roman" w:hAnsi="Times New Roman" w:cs="Times New Roman"/>
-          <w:sz w:val="28"/>
-          <w:szCs w:val="28"/>
-        </w:rPr>
-        <w:t>CreditPath</w:t>
-      </w:r>
-      <w:proofErr w:type="spellEnd"/>
-      <w:r>
-        <w:rPr>
-          <w:rFonts w:ascii="Times New Roman" w:hAnsi="Times New Roman" w:cs="Times New Roman"/>
-          <w:sz w:val="28"/>
-          <w:szCs w:val="28"/>
-        </w:rPr>
-        <w:t xml:space="preserve"> AI involves the development of a complete end-to-end system that integrates backend processing, frontend interaction, recommendation logic, and data visualization. The system is designed to handle user inputs, process them through API-based communication, and generate meaningful outputs in real time. It combines multiple technologies to ensure efficient data handling, accurate prediction, and clear presentation of results. The implementation focuses on creating a structured workflow where data flows seamlessly from input to output, enabling both users and financial institutions to make informed decisions.</w:t>
+        <w:t>The implementation of CreditPath AI involves the development of a complete end-to-end system that integrates backend processing, frontend interaction, recommendation logic, and data visualization. The system is designed to handle user inputs, process them through API-based communication, and generate meaningful outputs in real time. It combines multiple technologies to ensure efficient data handling, accurate prediction, and clear presentation of results. The implementation focuses on creating a structured workflow where data flows seamlessly from input to output, enabling both users and financial institutions to make informed decisions.</w:t>
       </w:r>
     </w:p>
     <w:p>
@@ -6136,61 +5724,25 @@
           <w:sz w:val="28"/>
           <w:szCs w:val="28"/>
         </w:rPr>
-        <w:t xml:space="preserve">The </w:t>
-      </w:r>
-      <w:proofErr w:type="spellStart"/>
-      <w:r>
-        <w:rPr>
-          <w:rFonts w:ascii="Times New Roman" w:hAnsi="Times New Roman" w:cs="Times New Roman"/>
-          <w:sz w:val="28"/>
-          <w:szCs w:val="28"/>
-        </w:rPr>
-        <w:t>CreditPath</w:t>
-      </w:r>
-      <w:proofErr w:type="spellEnd"/>
-      <w:r>
-        <w:rPr>
-          <w:rFonts w:ascii="Times New Roman" w:hAnsi="Times New Roman" w:cs="Times New Roman"/>
-          <w:sz w:val="28"/>
-          <w:szCs w:val="28"/>
-        </w:rPr>
-        <w:t xml:space="preserve"> AI system is built using a combination of modern web development and data visualization technologies. Each technology plays a specific role in ensuring the smooth functioning of the system.</w:t>
-      </w:r>
-    </w:p>
-    <w:p>
-      <w:pPr>
-        <w:jc w:val="both"/>
-        <w:rPr>
-          <w:rFonts w:ascii="Times New Roman" w:hAnsi="Times New Roman" w:cs="Times New Roman"/>
-          <w:sz w:val="28"/>
-          <w:szCs w:val="28"/>
-        </w:rPr>
-      </w:pPr>
-      <w:r>
-        <w:rPr>
-          <w:rFonts w:ascii="Times New Roman" w:hAnsi="Times New Roman" w:cs="Times New Roman"/>
-          <w:sz w:val="28"/>
-          <w:szCs w:val="28"/>
-        </w:rPr>
-        <w:t xml:space="preserve">React is used for developing the frontend interface, allowing the creation of dynamic and interactive user interfaces. It helps in building reusable components and managing user inputs efficiently. </w:t>
-      </w:r>
-      <w:proofErr w:type="spellStart"/>
-      <w:r>
-        <w:rPr>
-          <w:rFonts w:ascii="Times New Roman" w:hAnsi="Times New Roman" w:cs="Times New Roman"/>
-          <w:sz w:val="28"/>
-          <w:szCs w:val="28"/>
-        </w:rPr>
-        <w:t>FastAPI</w:t>
-      </w:r>
-      <w:proofErr w:type="spellEnd"/>
-      <w:r>
-        <w:rPr>
-          <w:rFonts w:ascii="Times New Roman" w:hAnsi="Times New Roman" w:cs="Times New Roman"/>
-          <w:sz w:val="28"/>
-          <w:szCs w:val="28"/>
-        </w:rPr>
-        <w:t xml:space="preserve"> is used as the backend framework, which enables fast and efficient API development. It handles data processing, request handling, and communication between the frontend and backend.</w:t>
+        <w:t>The CreditPath AI system is built using a combination of modern web development and data visualization technologies. Each technology plays a specific role in ensuring the smooth functioning of the system.</w:t>
+      </w:r>
+    </w:p>
+    <w:p>
+      <w:pPr>
+        <w:jc w:val="both"/>
+        <w:rPr>
+          <w:rFonts w:ascii="Times New Roman" w:hAnsi="Times New Roman" w:cs="Times New Roman"/>
+          <w:sz w:val="28"/>
+          <w:szCs w:val="28"/>
+        </w:rPr>
+      </w:pPr>
+      <w:r>
+        <w:rPr>
+          <w:rFonts w:ascii="Times New Roman" w:hAnsi="Times New Roman" w:cs="Times New Roman"/>
+          <w:sz w:val="28"/>
+          <w:szCs w:val="28"/>
+        </w:rPr>
+        <w:t>React is used for developing the frontend interface, allowing the creation of dynamic and interactive user interfaces. It helps in building reusable components and managing user inputs efficiently. FastAPI is used as the backend framework, which enables fast and efficient API development. It handles data processing, request handling, and communication between the frontend and backend.</w:t>
       </w:r>
     </w:p>
     <w:p>
@@ -6268,25 +5820,7 @@
           <w:sz w:val="28"/>
           <w:szCs w:val="28"/>
         </w:rPr>
-        <w:t xml:space="preserve">The backend is developed using </w:t>
-      </w:r>
-      <w:proofErr w:type="spellStart"/>
-      <w:r>
-        <w:rPr>
-          <w:rFonts w:ascii="Times New Roman" w:hAnsi="Times New Roman" w:cs="Times New Roman"/>
-          <w:sz w:val="28"/>
-          <w:szCs w:val="28"/>
-        </w:rPr>
-        <w:t>FastAPI</w:t>
-      </w:r>
-      <w:proofErr w:type="spellEnd"/>
-      <w:r>
-        <w:rPr>
-          <w:rFonts w:ascii="Times New Roman" w:hAnsi="Times New Roman" w:cs="Times New Roman"/>
-          <w:sz w:val="28"/>
-          <w:szCs w:val="28"/>
-        </w:rPr>
-        <w:t>, which provides high performance and supports asynchronous processing.</w:t>
+        <w:t>The backend is developed using FastAPI, which provides high performance and supports asynchronous processing.</w:t>
       </w:r>
     </w:p>
     <w:p>
@@ -6461,25 +5995,7 @@
           <w:sz w:val="28"/>
           <w:szCs w:val="28"/>
         </w:rPr>
-        <w:t xml:space="preserve">The backend of the system is developed using </w:t>
-      </w:r>
-      <w:proofErr w:type="spellStart"/>
-      <w:r>
-        <w:rPr>
-          <w:rFonts w:ascii="Times New Roman" w:hAnsi="Times New Roman" w:cs="Times New Roman"/>
-          <w:sz w:val="28"/>
-          <w:szCs w:val="28"/>
-        </w:rPr>
-        <w:t>FastAPI</w:t>
-      </w:r>
-      <w:proofErr w:type="spellEnd"/>
-      <w:r>
-        <w:rPr>
-          <w:rFonts w:ascii="Times New Roman" w:hAnsi="Times New Roman" w:cs="Times New Roman"/>
-          <w:sz w:val="28"/>
-          <w:szCs w:val="28"/>
-        </w:rPr>
-        <w:t xml:space="preserve"> and is responsible for handling all data processing tasks. It exposes API endpoints such as /user-risk and /bank-risk, which are used to process user and bank inputs respectively. When a request is received, the backend processes the data and generates the corresponding output. The API workflow ensures smooth communication between the frontend and backend, allowing real-time predictions.</w:t>
+        <w:t>The backend of the system is developed using FastAPI and is responsible for handling all data processing tasks. It exposes API endpoints such as /user-risk and /bank-risk, which are used to process user and bank inputs respectively. When a request is received, the backend processes the data and generates the corresponding output. The API workflow ensures smooth communication between the frontend and backend, allowing real-time predictions.</w:t>
       </w:r>
     </w:p>
     <w:p>
@@ -6765,7 +6281,7 @@
           <w:szCs w:val="28"/>
         </w:rPr>
         <w:drawing>
-          <wp:inline distT="0" distB="0" distL="0" distR="0" wp14:anchorId="1F26DBA7" wp14:editId="30C5646B">
+          <wp:inline distT="0" distB="0" distL="0" distR="0" wp14:anchorId="1F26DBA7" wp14:editId="59E79A92">
             <wp:extent cx="6640195" cy="3526790"/>
             <wp:effectExtent l="0" t="0" r="8255" b="0"/>
             <wp:docPr id="1572377089" name="Picture 11"/>
@@ -6880,7 +6396,7 @@
           <w:szCs w:val="28"/>
         </w:rPr>
         <w:drawing>
-          <wp:inline distT="0" distB="0" distL="0" distR="0" wp14:anchorId="42E1B7B8" wp14:editId="6851EA14">
+          <wp:inline distT="0" distB="0" distL="0" distR="0" wp14:anchorId="42E1B7B8" wp14:editId="0ED9F062">
             <wp:extent cx="6640195" cy="3526790"/>
             <wp:effectExtent l="0" t="0" r="8255" b="0"/>
             <wp:docPr id="124725762" name="Picture 12"/>
@@ -6958,7 +6474,7 @@
           <w:szCs w:val="28"/>
         </w:rPr>
         <w:drawing>
-          <wp:inline distT="0" distB="0" distL="0" distR="0" wp14:anchorId="6CC66106" wp14:editId="5EA18B60">
+          <wp:inline distT="0" distB="0" distL="0" distR="0" wp14:anchorId="6CC66106" wp14:editId="2243672D">
             <wp:extent cx="6640195" cy="3526790"/>
             <wp:effectExtent l="0" t="0" r="8255" b="0"/>
             <wp:docPr id="1853123228" name="Picture 13"/>
@@ -7106,7 +6622,7 @@
           <w:szCs w:val="28"/>
         </w:rPr>
         <w:drawing>
-          <wp:inline distT="0" distB="0" distL="0" distR="0" wp14:anchorId="27AE5766" wp14:editId="714DB9D5">
+          <wp:inline distT="0" distB="0" distL="0" distR="0" wp14:anchorId="27AE5766" wp14:editId="188ADCC0">
             <wp:extent cx="6640195" cy="3526790"/>
             <wp:effectExtent l="0" t="0" r="8255" b="0"/>
             <wp:docPr id="136755252" name="Picture 14"/>
@@ -7182,7 +6698,7 @@
           <w:szCs w:val="28"/>
         </w:rPr>
         <w:drawing>
-          <wp:inline distT="0" distB="0" distL="0" distR="0" wp14:anchorId="40758FB0" wp14:editId="294FB133">
+          <wp:inline distT="0" distB="0" distL="0" distR="0" wp14:anchorId="40758FB0" wp14:editId="33211E0E">
             <wp:extent cx="6640195" cy="3526790"/>
             <wp:effectExtent l="0" t="0" r="8255" b="0"/>
             <wp:docPr id="8420306" name="Picture 15"/>
@@ -7353,25 +6869,7 @@
           <w:sz w:val="28"/>
           <w:szCs w:val="28"/>
         </w:rPr>
-        <w:t xml:space="preserve">The user recommendation engine is designed to evaluate the financial condition of the borrower based on input parameters. It uses rule-based logic to </w:t>
-      </w:r>
-      <w:proofErr w:type="spellStart"/>
-      <w:r>
-        <w:rPr>
-          <w:rFonts w:ascii="Times New Roman" w:hAnsi="Times New Roman" w:cs="Times New Roman"/>
-          <w:sz w:val="28"/>
-          <w:szCs w:val="28"/>
-        </w:rPr>
-        <w:t>analyze</w:t>
-      </w:r>
-      <w:proofErr w:type="spellEnd"/>
-      <w:r>
-        <w:rPr>
-          <w:rFonts w:ascii="Times New Roman" w:hAnsi="Times New Roman" w:cs="Times New Roman"/>
-          <w:sz w:val="28"/>
-          <w:szCs w:val="28"/>
-        </w:rPr>
-        <w:t xml:space="preserve"> inputs such as credit score, income, loan amount, and repayment history. The logic determines the financial stability of the user and generates appropriate outputs.</w:t>
+        <w:t>The user recommendation engine is designed to evaluate the financial condition of the borrower based on input parameters. It uses rule-based logic to analyze inputs such as credit score, income, loan amount, and repayment history. The logic determines the financial stability of the user and generates appropriate outputs.</w:t>
       </w:r>
     </w:p>
     <w:p>
@@ -7535,25 +7033,7 @@
           <w:sz w:val="28"/>
           <w:szCs w:val="28"/>
         </w:rPr>
-        <w:t xml:space="preserve">For example, if a user has a high credit score and stable income, the system classifies them as low risk and suggests maintaining their financial habits. If the credit score is moderate, the system provides suggestions such as improving repayment </w:t>
-      </w:r>
-      <w:proofErr w:type="spellStart"/>
-      <w:r>
-        <w:rPr>
-          <w:rFonts w:ascii="Times New Roman" w:hAnsi="Times New Roman" w:cs="Times New Roman"/>
-          <w:sz w:val="28"/>
-          <w:szCs w:val="28"/>
-        </w:rPr>
-        <w:t>behavior</w:t>
-      </w:r>
-      <w:proofErr w:type="spellEnd"/>
-      <w:r>
-        <w:rPr>
-          <w:rFonts w:ascii="Times New Roman" w:hAnsi="Times New Roman" w:cs="Times New Roman"/>
-          <w:sz w:val="28"/>
-          <w:szCs w:val="28"/>
-        </w:rPr>
-        <w:t>. In the case of low credit scores, the system advises users to reduce debt and avoid applying for loans until their financial condition</w:t>
+        <w:t>For example, if a user has a high credit score and stable income, the system classifies them as low risk and suggests maintaining their financial habits. If the credit score is moderate, the system provides suggestions such as improving repayment behavior. In the case of low credit scores, the system advises users to reduce debt and avoid applying for loans until their financial condition</w:t>
       </w:r>
       <w:r>
         <w:rPr>
@@ -7599,7 +7079,7 @@
           <w:szCs w:val="28"/>
         </w:rPr>
         <w:drawing>
-          <wp:inline distT="0" distB="0" distL="0" distR="0" wp14:anchorId="4F939B64" wp14:editId="6CBD19DA">
+          <wp:inline distT="0" distB="0" distL="0" distR="0" wp14:anchorId="4F939B64" wp14:editId="4DD658FF">
             <wp:extent cx="6640195" cy="3526790"/>
             <wp:effectExtent l="0" t="0" r="8255" b="0"/>
             <wp:docPr id="1734418764" name="Picture 16"/>
@@ -7811,7 +7291,7 @@
           <w:szCs w:val="28"/>
         </w:rPr>
         <w:drawing>
-          <wp:inline distT="0" distB="0" distL="0" distR="0" wp14:anchorId="321C412D" wp14:editId="08B294DE">
+          <wp:inline distT="0" distB="0" distL="0" distR="0" wp14:anchorId="321C412D" wp14:editId="4FCEDBE2">
             <wp:extent cx="6640195" cy="3526790"/>
             <wp:effectExtent l="0" t="0" r="8255" b="0"/>
             <wp:docPr id="389131005" name="Picture 17"/>
@@ -8164,10 +7644,10 @@
           <w:szCs w:val="28"/>
         </w:rPr>
         <w:drawing>
-          <wp:inline distT="0" distB="0" distL="0" distR="0" wp14:anchorId="1F0E1E97" wp14:editId="429E1E9B">
-            <wp:extent cx="6640195" cy="3526790"/>
-            <wp:effectExtent l="0" t="0" r="8255" b="0"/>
-            <wp:docPr id="1124053875" name="Picture 10"/>
+          <wp:inline distT="0" distB="0" distL="0" distR="0" wp14:anchorId="43B4FE85" wp14:editId="6971DA41">
+            <wp:extent cx="6637020" cy="3733800"/>
+            <wp:effectExtent l="0" t="0" r="0" b="0"/>
+            <wp:docPr id="2132110512" name="Picture 1"/>
             <wp:cNvGraphicFramePr>
               <a:graphicFrameLocks xmlns:a="http://schemas.openxmlformats.org/drawingml/2006/main" noChangeAspect="1"/>
             </wp:cNvGraphicFramePr>
@@ -8175,7 +7655,7 @@
               <a:graphicData uri="http://schemas.openxmlformats.org/drawingml/2006/picture">
                 <pic:pic xmlns:pic="http://schemas.openxmlformats.org/drawingml/2006/picture">
                   <pic:nvPicPr>
-                    <pic:cNvPr id="0" name="Picture 292"/>
+                    <pic:cNvPr id="0" name="Picture 1"/>
                     <pic:cNvPicPr>
                       <a:picLocks noChangeAspect="1" noChangeArrowheads="1"/>
                     </pic:cNvPicPr>
@@ -8196,7 +7676,7 @@
                   <pic:spPr bwMode="auto">
                     <a:xfrm>
                       <a:off x="0" y="0"/>
-                      <a:ext cx="6640195" cy="3526790"/>
+                      <a:ext cx="6637020" cy="3733800"/>
                     </a:xfrm>
                     <a:prstGeom prst="rect">
                       <a:avLst/>
@@ -8235,16 +7715,6 @@
     </w:p>
     <w:p>
       <w:pPr>
-        <w:jc w:val="both"/>
-        <w:rPr>
-          <w:rFonts w:ascii="Times New Roman" w:hAnsi="Times New Roman" w:cs="Times New Roman"/>
-          <w:sz w:val="28"/>
-          <w:szCs w:val="28"/>
-        </w:rPr>
-      </w:pPr>
-    </w:p>
-    <w:p>
-      <w:pPr>
         <w:jc w:val="center"/>
         <w:rPr>
           <w:rFonts w:ascii="Times New Roman" w:hAnsi="Times New Roman" w:cs="Times New Roman"/>
@@ -8271,182 +7741,22 @@
         <w:jc w:val="both"/>
         <w:rPr>
           <w:rFonts w:ascii="Times New Roman" w:hAnsi="Times New Roman" w:cs="Times New Roman"/>
-          <w:b/>
-          <w:bCs/>
-          <w:sz w:val="28"/>
-          <w:szCs w:val="28"/>
-        </w:rPr>
-      </w:pPr>
-      <w:r>
-        <w:rPr>
-          <w:rFonts w:ascii="Times New Roman" w:hAnsi="Times New Roman" w:cs="Times New Roman"/>
-          <w:b/>
-          <w:bCs/>
-          <w:sz w:val="28"/>
-          <w:szCs w:val="28"/>
-        </w:rPr>
-        <w:t>4</w:t>
-      </w:r>
-      <w:r>
-        <w:rPr>
-          <w:rFonts w:ascii="Times New Roman" w:hAnsi="Times New Roman" w:cs="Times New Roman"/>
-          <w:b/>
-          <w:bCs/>
-          <w:sz w:val="28"/>
-          <w:szCs w:val="28"/>
-        </w:rPr>
-        <w:t>.6 Charts &amp; Visualization</w:t>
-      </w:r>
-    </w:p>
-    <w:p>
-      <w:pPr>
-        <w:jc w:val="both"/>
-        <w:rPr>
-          <w:rFonts w:ascii="Times New Roman" w:hAnsi="Times New Roman" w:cs="Times New Roman"/>
-          <w:b/>
-          <w:bCs/>
-          <w:sz w:val="28"/>
-          <w:szCs w:val="28"/>
-        </w:rPr>
-      </w:pPr>
-      <w:r>
-        <w:rPr>
-          <w:rFonts w:ascii="Times New Roman" w:hAnsi="Times New Roman" w:cs="Times New Roman"/>
-          <w:b/>
-          <w:bCs/>
-          <w:sz w:val="28"/>
-          <w:szCs w:val="28"/>
-        </w:rPr>
-        <w:t>User Charts</w:t>
-      </w:r>
-    </w:p>
-    <w:p>
-      <w:pPr>
-        <w:jc w:val="both"/>
-        <w:rPr>
-          <w:rFonts w:ascii="Times New Roman" w:hAnsi="Times New Roman" w:cs="Times New Roman"/>
-          <w:sz w:val="28"/>
-          <w:szCs w:val="28"/>
-        </w:rPr>
-      </w:pPr>
-      <w:r>
-        <w:rPr>
-          <w:rFonts w:ascii="Times New Roman" w:hAnsi="Times New Roman" w:cs="Times New Roman"/>
-          <w:sz w:val="28"/>
-          <w:szCs w:val="28"/>
-        </w:rPr>
-        <w:t>The system uses a pie chart to represent the distribution of the user’s credit score, helping visualize financial strength. A semi-circular chart is used to display the loan approval percentage, giving users an idea of their approval chances. A bar graph is used to compare financial parameters such as income and credit score, providing a clear overview of the user’s financial condition.</w:t>
-      </w:r>
-    </w:p>
-    <w:p>
-      <w:pPr>
-        <w:jc w:val="both"/>
-        <w:rPr>
-          <w:rFonts w:ascii="Times New Roman" w:hAnsi="Times New Roman" w:cs="Times New Roman"/>
-          <w:sz w:val="28"/>
-          <w:szCs w:val="28"/>
-        </w:rPr>
-      </w:pPr>
-      <w:r>
-        <w:rPr>
-          <w:rFonts w:ascii="Times New Roman" w:hAnsi="Times New Roman" w:cs="Times New Roman"/>
-          <w:sz w:val="28"/>
-          <w:szCs w:val="28"/>
-        </w:rPr>
-        <w:t>User Charts:</w:t>
-      </w:r>
-    </w:p>
-    <w:p>
-      <w:pPr>
-        <w:numPr>
-          <w:ilvl w:val="0"/>
-          <w:numId w:val="18"/>
-        </w:numPr>
-        <w:jc w:val="both"/>
-        <w:rPr>
-          <w:rFonts w:ascii="Times New Roman" w:hAnsi="Times New Roman" w:cs="Times New Roman"/>
-          <w:sz w:val="28"/>
-          <w:szCs w:val="28"/>
-        </w:rPr>
-      </w:pPr>
-      <w:r>
-        <w:rPr>
-          <w:rFonts w:ascii="Times New Roman" w:hAnsi="Times New Roman" w:cs="Times New Roman"/>
-          <w:sz w:val="28"/>
-          <w:szCs w:val="28"/>
-        </w:rPr>
-        <w:t xml:space="preserve">Pie Chart → Credit distribution </w:t>
-      </w:r>
-    </w:p>
-    <w:p>
-      <w:pPr>
-        <w:numPr>
-          <w:ilvl w:val="0"/>
-          <w:numId w:val="18"/>
-        </w:numPr>
-        <w:jc w:val="both"/>
-        <w:rPr>
-          <w:rFonts w:ascii="Times New Roman" w:hAnsi="Times New Roman" w:cs="Times New Roman"/>
-          <w:sz w:val="28"/>
-          <w:szCs w:val="28"/>
-        </w:rPr>
-      </w:pPr>
-      <w:r>
-        <w:rPr>
-          <w:rFonts w:ascii="Times New Roman" w:hAnsi="Times New Roman" w:cs="Times New Roman"/>
-          <w:sz w:val="28"/>
-          <w:szCs w:val="28"/>
-        </w:rPr>
-        <w:t xml:space="preserve">Semi-circle → Loan approval % </w:t>
-      </w:r>
-    </w:p>
-    <w:p>
-      <w:pPr>
-        <w:numPr>
-          <w:ilvl w:val="0"/>
-          <w:numId w:val="18"/>
-        </w:numPr>
-        <w:jc w:val="both"/>
-        <w:rPr>
-          <w:rFonts w:ascii="Times New Roman" w:hAnsi="Times New Roman" w:cs="Times New Roman"/>
-          <w:sz w:val="28"/>
-          <w:szCs w:val="28"/>
-        </w:rPr>
-      </w:pPr>
-      <w:r>
-        <w:rPr>
-          <w:rFonts w:ascii="Times New Roman" w:hAnsi="Times New Roman" w:cs="Times New Roman"/>
-          <w:sz w:val="28"/>
-          <w:szCs w:val="28"/>
-        </w:rPr>
-        <w:t xml:space="preserve">Bar Chart → Financial overview </w:t>
-      </w:r>
-    </w:p>
-    <w:p>
-      <w:pPr>
-        <w:jc w:val="both"/>
-        <w:rPr>
-          <w:rFonts w:ascii="Times New Roman" w:hAnsi="Times New Roman" w:cs="Times New Roman"/>
-          <w:b/>
-          <w:bCs/>
-          <w:sz w:val="28"/>
-          <w:szCs w:val="28"/>
-        </w:rPr>
-      </w:pPr>
-      <w:r>
-        <w:rPr>
-          <w:rFonts w:ascii="Times New Roman" w:hAnsi="Times New Roman" w:cs="Times New Roman"/>
-          <w:b/>
-          <w:bCs/>
+          <w:sz w:val="28"/>
+          <w:szCs w:val="28"/>
+        </w:rPr>
+      </w:pPr>
+      <w:r>
+        <w:rPr>
+          <w:rFonts w:ascii="Times New Roman" w:hAnsi="Times New Roman" w:cs="Times New Roman"/>
           <w:noProof/>
           <w:sz w:val="28"/>
           <w:szCs w:val="28"/>
         </w:rPr>
         <w:drawing>
-          <wp:inline distT="0" distB="0" distL="0" distR="0" wp14:anchorId="7BB6ABAA" wp14:editId="78283F37">
-            <wp:extent cx="6640195" cy="3526790"/>
-            <wp:effectExtent l="0" t="0" r="8255" b="0"/>
-            <wp:docPr id="2135538840" name="Picture 18"/>
+          <wp:inline distT="0" distB="0" distL="0" distR="0" wp14:anchorId="5A37603C" wp14:editId="365802D8">
+            <wp:extent cx="6637020" cy="3733800"/>
+            <wp:effectExtent l="0" t="0" r="0" b="0"/>
+            <wp:docPr id="1560493678" name="Picture 2"/>
             <wp:cNvGraphicFramePr>
               <a:graphicFrameLocks xmlns:a="http://schemas.openxmlformats.org/drawingml/2006/main" noChangeAspect="1"/>
             </wp:cNvGraphicFramePr>
@@ -8454,7 +7764,7 @@
               <a:graphicData uri="http://schemas.openxmlformats.org/drawingml/2006/picture">
                 <pic:pic xmlns:pic="http://schemas.openxmlformats.org/drawingml/2006/picture">
                   <pic:nvPicPr>
-                    <pic:cNvPr id="0" name="Picture 300"/>
+                    <pic:cNvPr id="0" name="Picture 2"/>
                     <pic:cNvPicPr>
                       <a:picLocks noChangeAspect="1" noChangeArrowheads="1"/>
                     </pic:cNvPicPr>
@@ -8475,7 +7785,7 @@
                   <pic:spPr bwMode="auto">
                     <a:xfrm>
                       <a:off x="0" y="0"/>
-                      <a:ext cx="6640195" cy="3526790"/>
+                      <a:ext cx="6637020" cy="3733800"/>
                     </a:xfrm>
                     <a:prstGeom prst="rect">
                       <a:avLst/>
@@ -8511,68 +7821,82 @@
           <w:sz w:val="28"/>
           <w:szCs w:val="28"/>
         </w:rPr>
-        <w:t>Bank Charts</w:t>
-      </w:r>
-    </w:p>
-    <w:p>
-      <w:pPr>
-        <w:jc w:val="both"/>
-        <w:rPr>
-          <w:rFonts w:ascii="Times New Roman" w:hAnsi="Times New Roman" w:cs="Times New Roman"/>
-          <w:sz w:val="28"/>
-          <w:szCs w:val="28"/>
-        </w:rPr>
-      </w:pPr>
-      <w:r>
-        <w:rPr>
-          <w:rFonts w:ascii="Times New Roman" w:hAnsi="Times New Roman" w:cs="Times New Roman"/>
-          <w:sz w:val="28"/>
-          <w:szCs w:val="28"/>
-        </w:rPr>
-        <w:t xml:space="preserve">For banks, bar graphs are used to represent risk metrics such as default probability and expected loss. A pie chart is used to show the distribution between risk and safe categories. These visualizations help banks quickly </w:t>
-      </w:r>
-      <w:proofErr w:type="spellStart"/>
-      <w:r>
-        <w:rPr>
-          <w:rFonts w:ascii="Times New Roman" w:hAnsi="Times New Roman" w:cs="Times New Roman"/>
-          <w:sz w:val="28"/>
-          <w:szCs w:val="28"/>
-        </w:rPr>
-        <w:t>analyze</w:t>
-      </w:r>
-      <w:proofErr w:type="spellEnd"/>
-      <w:r>
-        <w:rPr>
-          <w:rFonts w:ascii="Times New Roman" w:hAnsi="Times New Roman" w:cs="Times New Roman"/>
-          <w:sz w:val="28"/>
-          <w:szCs w:val="28"/>
-        </w:rPr>
-        <w:t xml:space="preserve"> borrower profiles and make decisions.</w:t>
-      </w:r>
-    </w:p>
-    <w:p>
-      <w:pPr>
-        <w:jc w:val="both"/>
-        <w:rPr>
-          <w:rFonts w:ascii="Times New Roman" w:hAnsi="Times New Roman" w:cs="Times New Roman"/>
-          <w:sz w:val="28"/>
-          <w:szCs w:val="28"/>
-        </w:rPr>
-      </w:pPr>
-      <w:r>
-        <w:rPr>
-          <w:rFonts w:ascii="Times New Roman" w:hAnsi="Times New Roman" w:cs="Times New Roman"/>
-          <w:sz w:val="28"/>
-          <w:szCs w:val="28"/>
-        </w:rPr>
-        <w:t>Bank Charts:</w:t>
+        <w:t>4</w:t>
+      </w:r>
+      <w:r>
+        <w:rPr>
+          <w:rFonts w:ascii="Times New Roman" w:hAnsi="Times New Roman" w:cs="Times New Roman"/>
+          <w:b/>
+          <w:bCs/>
+          <w:sz w:val="28"/>
+          <w:szCs w:val="28"/>
+        </w:rPr>
+        <w:t>.6 Charts &amp; Visualization</w:t>
+      </w:r>
+    </w:p>
+    <w:p>
+      <w:pPr>
+        <w:jc w:val="both"/>
+        <w:rPr>
+          <w:rFonts w:ascii="Times New Roman" w:hAnsi="Times New Roman" w:cs="Times New Roman"/>
+          <w:b/>
+          <w:bCs/>
+          <w:sz w:val="28"/>
+          <w:szCs w:val="28"/>
+        </w:rPr>
+      </w:pPr>
+      <w:r>
+        <w:rPr>
+          <w:rFonts w:ascii="Times New Roman" w:hAnsi="Times New Roman" w:cs="Times New Roman"/>
+          <w:b/>
+          <w:bCs/>
+          <w:sz w:val="28"/>
+          <w:szCs w:val="28"/>
+        </w:rPr>
+        <w:t>User Charts</w:t>
+      </w:r>
+    </w:p>
+    <w:p>
+      <w:pPr>
+        <w:jc w:val="both"/>
+        <w:rPr>
+          <w:rFonts w:ascii="Times New Roman" w:hAnsi="Times New Roman" w:cs="Times New Roman"/>
+          <w:sz w:val="28"/>
+          <w:szCs w:val="28"/>
+        </w:rPr>
+      </w:pPr>
+      <w:r>
+        <w:rPr>
+          <w:rFonts w:ascii="Times New Roman" w:hAnsi="Times New Roman" w:cs="Times New Roman"/>
+          <w:sz w:val="28"/>
+          <w:szCs w:val="28"/>
+        </w:rPr>
+        <w:t>The system uses a pie chart to represent the distribution of the user’s credit score, helping visualize financial strength. A semi-circular chart is used to display the loan approval percentage, giving users an idea of their approval chances. A bar graph is used to compare financial parameters such as income and credit score, providing a clear overview of the user’s financial condition.</w:t>
+      </w:r>
+    </w:p>
+    <w:p>
+      <w:pPr>
+        <w:jc w:val="both"/>
+        <w:rPr>
+          <w:rFonts w:ascii="Times New Roman" w:hAnsi="Times New Roman" w:cs="Times New Roman"/>
+          <w:sz w:val="28"/>
+          <w:szCs w:val="28"/>
+        </w:rPr>
+      </w:pPr>
+      <w:r>
+        <w:rPr>
+          <w:rFonts w:ascii="Times New Roman" w:hAnsi="Times New Roman" w:cs="Times New Roman"/>
+          <w:sz w:val="28"/>
+          <w:szCs w:val="28"/>
+        </w:rPr>
+        <w:t>User Charts:</w:t>
       </w:r>
     </w:p>
     <w:p>
       <w:pPr>
         <w:numPr>
           <w:ilvl w:val="0"/>
-          <w:numId w:val="19"/>
+          <w:numId w:val="18"/>
         </w:numPr>
         <w:jc w:val="both"/>
         <w:rPr>
@@ -8587,14 +7911,14 @@
           <w:sz w:val="28"/>
           <w:szCs w:val="28"/>
         </w:rPr>
-        <w:t xml:space="preserve">Bar Graph → Risk analysis </w:t>
+        <w:t xml:space="preserve">Pie Chart → Credit distribution </w:t>
       </w:r>
     </w:p>
     <w:p>
       <w:pPr>
         <w:numPr>
           <w:ilvl w:val="0"/>
-          <w:numId w:val="19"/>
+          <w:numId w:val="18"/>
         </w:numPr>
         <w:jc w:val="both"/>
         <w:rPr>
@@ -8609,14 +7933,14 @@
           <w:sz w:val="28"/>
           <w:szCs w:val="28"/>
         </w:rPr>
-        <w:t xml:space="preserve">Pie Chart → Risk distribution </w:t>
+        <w:t xml:space="preserve">Semi-circle → Loan approval % </w:t>
       </w:r>
     </w:p>
     <w:p>
       <w:pPr>
         <w:numPr>
           <w:ilvl w:val="0"/>
-          <w:numId w:val="19"/>
+          <w:numId w:val="18"/>
         </w:numPr>
         <w:jc w:val="both"/>
         <w:rPr>
@@ -8631,8 +7955,74 @@
           <w:sz w:val="28"/>
           <w:szCs w:val="28"/>
         </w:rPr>
-        <w:t>Bar Graph → Decision metrics</w:t>
-      </w:r>
+        <w:t xml:space="preserve">Bar Chart → Financial overview </w:t>
+      </w:r>
+    </w:p>
+    <w:p>
+      <w:pPr>
+        <w:ind w:left="360"/>
+        <w:jc w:val="both"/>
+        <w:rPr>
+          <w:rFonts w:ascii="Times New Roman" w:hAnsi="Times New Roman" w:cs="Times New Roman"/>
+          <w:sz w:val="28"/>
+          <w:szCs w:val="28"/>
+        </w:rPr>
+      </w:pPr>
+    </w:p>
+    <w:p>
+      <w:pPr>
+        <w:ind w:left="360"/>
+        <w:jc w:val="both"/>
+        <w:rPr>
+          <w:rFonts w:ascii="Times New Roman" w:hAnsi="Times New Roman" w:cs="Times New Roman"/>
+          <w:sz w:val="28"/>
+          <w:szCs w:val="28"/>
+        </w:rPr>
+      </w:pPr>
+    </w:p>
+    <w:p>
+      <w:pPr>
+        <w:ind w:left="360"/>
+        <w:jc w:val="both"/>
+        <w:rPr>
+          <w:rFonts w:ascii="Times New Roman" w:hAnsi="Times New Roman" w:cs="Times New Roman"/>
+          <w:sz w:val="28"/>
+          <w:szCs w:val="28"/>
+        </w:rPr>
+      </w:pPr>
+    </w:p>
+    <w:p>
+      <w:pPr>
+        <w:ind w:left="360"/>
+        <w:jc w:val="both"/>
+        <w:rPr>
+          <w:rFonts w:ascii="Times New Roman" w:hAnsi="Times New Roman" w:cs="Times New Roman"/>
+          <w:sz w:val="28"/>
+          <w:szCs w:val="28"/>
+        </w:rPr>
+      </w:pPr>
+    </w:p>
+    <w:p>
+      <w:pPr>
+        <w:ind w:left="360"/>
+        <w:jc w:val="both"/>
+        <w:rPr>
+          <w:rFonts w:ascii="Times New Roman" w:hAnsi="Times New Roman" w:cs="Times New Roman"/>
+          <w:sz w:val="28"/>
+          <w:szCs w:val="28"/>
+        </w:rPr>
+      </w:pPr>
+    </w:p>
+    <w:p>
+      <w:pPr>
+        <w:ind w:left="360"/>
+        <w:jc w:val="both"/>
+        <w:rPr>
+          <w:rFonts w:ascii="Times New Roman" w:hAnsi="Times New Roman" w:cs="Times New Roman"/>
+          <w:sz w:val="28"/>
+          <w:szCs w:val="28"/>
+        </w:rPr>
+      </w:pPr>
     </w:p>
     <w:p>
       <w:pPr>
@@ -8662,22 +8052,26 @@
         <w:jc w:val="both"/>
         <w:rPr>
           <w:rFonts w:ascii="Times New Roman" w:hAnsi="Times New Roman" w:cs="Times New Roman"/>
-          <w:sz w:val="28"/>
-          <w:szCs w:val="28"/>
-        </w:rPr>
-      </w:pPr>
-      <w:r>
-        <w:rPr>
-          <w:rFonts w:ascii="Times New Roman" w:hAnsi="Times New Roman" w:cs="Times New Roman"/>
+          <w:b/>
+          <w:bCs/>
+          <w:sz w:val="28"/>
+          <w:szCs w:val="28"/>
+        </w:rPr>
+      </w:pPr>
+      <w:r>
+        <w:rPr>
+          <w:rFonts w:ascii="Times New Roman" w:hAnsi="Times New Roman" w:cs="Times New Roman"/>
+          <w:b/>
+          <w:bCs/>
           <w:noProof/>
           <w:sz w:val="28"/>
           <w:szCs w:val="28"/>
         </w:rPr>
         <w:drawing>
-          <wp:inline distT="0" distB="0" distL="0" distR="0" wp14:anchorId="6770A248" wp14:editId="6A1F0EC9">
+          <wp:inline distT="0" distB="0" distL="0" distR="0" wp14:anchorId="7BB6ABAA" wp14:editId="3F79950E">
             <wp:extent cx="6640195" cy="3526790"/>
             <wp:effectExtent l="0" t="0" r="8255" b="0"/>
-            <wp:docPr id="2077812381" name="Picture 19"/>
+            <wp:docPr id="2135538840" name="Picture 18"/>
             <wp:cNvGraphicFramePr>
               <a:graphicFrameLocks xmlns:a="http://schemas.openxmlformats.org/drawingml/2006/main" noChangeAspect="1"/>
             </wp:cNvGraphicFramePr>
@@ -8685,7 +8079,7 @@
               <a:graphicData uri="http://schemas.openxmlformats.org/drawingml/2006/picture">
                 <pic:pic xmlns:pic="http://schemas.openxmlformats.org/drawingml/2006/picture">
                   <pic:nvPicPr>
-                    <pic:cNvPr id="0" name="Picture 301"/>
+                    <pic:cNvPr id="0" name="Picture 300"/>
                     <pic:cNvPicPr>
                       <a:picLocks noChangeAspect="1" noChangeArrowheads="1"/>
                     </pic:cNvPicPr>
@@ -8728,191 +8122,227 @@
         <w:jc w:val="both"/>
         <w:rPr>
           <w:rFonts w:ascii="Times New Roman" w:hAnsi="Times New Roman" w:cs="Times New Roman"/>
-          <w:sz w:val="28"/>
-          <w:szCs w:val="28"/>
-        </w:rPr>
-      </w:pPr>
-    </w:p>
-    <w:p>
-      <w:pPr>
-        <w:jc w:val="both"/>
-        <w:rPr>
-          <w:rFonts w:ascii="Times New Roman" w:hAnsi="Times New Roman" w:cs="Times New Roman"/>
-          <w:b/>
-          <w:bCs/>
-          <w:sz w:val="28"/>
-          <w:szCs w:val="28"/>
-        </w:rPr>
-      </w:pPr>
-      <w:r>
-        <w:rPr>
-          <w:rFonts w:ascii="Times New Roman" w:hAnsi="Times New Roman" w:cs="Times New Roman"/>
-          <w:b/>
-          <w:bCs/>
-          <w:sz w:val="28"/>
-          <w:szCs w:val="28"/>
-        </w:rPr>
-        <w:t>4</w:t>
-      </w:r>
-      <w:r>
-        <w:rPr>
-          <w:rFonts w:ascii="Times New Roman" w:hAnsi="Times New Roman" w:cs="Times New Roman"/>
-          <w:b/>
-          <w:bCs/>
-          <w:sz w:val="28"/>
-          <w:szCs w:val="28"/>
-        </w:rPr>
-        <w:t>.7 API Integration Flow</w:t>
-      </w:r>
-    </w:p>
-    <w:p>
-      <w:pPr>
-        <w:jc w:val="both"/>
-        <w:rPr>
-          <w:rFonts w:ascii="Times New Roman" w:hAnsi="Times New Roman" w:cs="Times New Roman"/>
-          <w:b/>
-          <w:bCs/>
-          <w:sz w:val="28"/>
-          <w:szCs w:val="28"/>
-        </w:rPr>
-      </w:pPr>
-      <w:r>
-        <w:rPr>
-          <w:rFonts w:ascii="Times New Roman" w:hAnsi="Times New Roman" w:cs="Times New Roman"/>
-          <w:b/>
-          <w:bCs/>
-          <w:sz w:val="28"/>
-          <w:szCs w:val="28"/>
-        </w:rPr>
-        <w:t>Axios Request</w:t>
-      </w:r>
-    </w:p>
-    <w:p>
-      <w:pPr>
-        <w:jc w:val="both"/>
-        <w:rPr>
-          <w:rFonts w:ascii="Times New Roman" w:hAnsi="Times New Roman" w:cs="Times New Roman"/>
-          <w:sz w:val="28"/>
-          <w:szCs w:val="28"/>
-        </w:rPr>
-      </w:pPr>
-      <w:r>
-        <w:rPr>
-          <w:rFonts w:ascii="Times New Roman" w:hAnsi="Times New Roman" w:cs="Times New Roman"/>
-          <w:sz w:val="28"/>
-          <w:szCs w:val="28"/>
-        </w:rPr>
-        <w:t>When the user submits input data, the frontend sends a request to the backend using Axios. The data is formatted into JSON and sent to the appropriate API endpoint.</w:t>
-      </w:r>
-    </w:p>
-    <w:p>
-      <w:pPr>
-        <w:jc w:val="both"/>
-        <w:rPr>
-          <w:rFonts w:ascii="Times New Roman" w:hAnsi="Times New Roman" w:cs="Times New Roman"/>
-          <w:sz w:val="28"/>
-          <w:szCs w:val="28"/>
-        </w:rPr>
-      </w:pPr>
-    </w:p>
-    <w:p>
-      <w:pPr>
-        <w:jc w:val="both"/>
-        <w:rPr>
-          <w:rFonts w:ascii="Times New Roman" w:hAnsi="Times New Roman" w:cs="Times New Roman"/>
-          <w:b/>
-          <w:bCs/>
-          <w:sz w:val="28"/>
-          <w:szCs w:val="28"/>
-        </w:rPr>
-      </w:pPr>
-      <w:r>
-        <w:rPr>
-          <w:rFonts w:ascii="Times New Roman" w:hAnsi="Times New Roman" w:cs="Times New Roman"/>
-          <w:b/>
-          <w:bCs/>
-          <w:sz w:val="28"/>
-          <w:szCs w:val="28"/>
-        </w:rPr>
-        <w:t>Backend Response</w:t>
-      </w:r>
-    </w:p>
-    <w:p>
-      <w:pPr>
-        <w:jc w:val="both"/>
-        <w:rPr>
-          <w:rFonts w:ascii="Times New Roman" w:hAnsi="Times New Roman" w:cs="Times New Roman"/>
-          <w:sz w:val="28"/>
-          <w:szCs w:val="28"/>
-        </w:rPr>
-      </w:pPr>
-      <w:r>
-        <w:rPr>
-          <w:rFonts w:ascii="Times New Roman" w:hAnsi="Times New Roman" w:cs="Times New Roman"/>
-          <w:sz w:val="28"/>
-          <w:szCs w:val="28"/>
-        </w:rPr>
-        <w:t>The backend processes the request and returns the output in JSON format. This output includes risk levels, recommendations, and other relevant metrics.</w:t>
-      </w:r>
-    </w:p>
-    <w:p>
-      <w:pPr>
-        <w:jc w:val="both"/>
-        <w:rPr>
-          <w:rFonts w:ascii="Times New Roman" w:hAnsi="Times New Roman" w:cs="Times New Roman"/>
-          <w:sz w:val="28"/>
-          <w:szCs w:val="28"/>
-        </w:rPr>
-      </w:pPr>
-    </w:p>
-    <w:p>
-      <w:pPr>
-        <w:jc w:val="both"/>
-        <w:rPr>
-          <w:rFonts w:ascii="Times New Roman" w:hAnsi="Times New Roman" w:cs="Times New Roman"/>
-          <w:b/>
-          <w:bCs/>
-          <w:sz w:val="28"/>
-          <w:szCs w:val="28"/>
-        </w:rPr>
-      </w:pPr>
-      <w:r>
-        <w:rPr>
-          <w:rFonts w:ascii="Times New Roman" w:hAnsi="Times New Roman" w:cs="Times New Roman"/>
-          <w:b/>
-          <w:bCs/>
-          <w:sz w:val="28"/>
-          <w:szCs w:val="28"/>
-        </w:rPr>
-        <w:t>Rendering</w:t>
-      </w:r>
-    </w:p>
-    <w:p>
-      <w:pPr>
-        <w:jc w:val="both"/>
-        <w:rPr>
-          <w:rFonts w:ascii="Times New Roman" w:hAnsi="Times New Roman" w:cs="Times New Roman"/>
-          <w:sz w:val="28"/>
-          <w:szCs w:val="28"/>
-        </w:rPr>
-      </w:pPr>
-      <w:r>
-        <w:rPr>
-          <w:rFonts w:ascii="Times New Roman" w:hAnsi="Times New Roman" w:cs="Times New Roman"/>
-          <w:sz w:val="28"/>
-          <w:szCs w:val="28"/>
-        </w:rPr>
-        <w:t>The frontend receives the response and dynamically displays the results. Charts and text outputs are rendered based on the received data, providing a complete view of the prediction.</w:t>
-      </w:r>
-    </w:p>
-    <w:p/>
-    <w:p>
-      <w:r>
-        <w:br w:type="page"/>
-      </w:r>
-    </w:p>
-    <w:p>
-      <w:pPr>
+          <w:b/>
+          <w:bCs/>
+          <w:sz w:val="28"/>
+          <w:szCs w:val="28"/>
+        </w:rPr>
+      </w:pPr>
+      <w:r>
+        <w:rPr>
+          <w:rFonts w:ascii="Times New Roman" w:hAnsi="Times New Roman" w:cs="Times New Roman"/>
+          <w:b/>
+          <w:bCs/>
+          <w:sz w:val="28"/>
+          <w:szCs w:val="28"/>
+        </w:rPr>
+        <w:t>Bank Charts</w:t>
+      </w:r>
+    </w:p>
+    <w:p>
+      <w:pPr>
+        <w:jc w:val="both"/>
+        <w:rPr>
+          <w:rFonts w:ascii="Times New Roman" w:hAnsi="Times New Roman" w:cs="Times New Roman"/>
+          <w:sz w:val="28"/>
+          <w:szCs w:val="28"/>
+        </w:rPr>
+      </w:pPr>
+      <w:r>
+        <w:rPr>
+          <w:rFonts w:ascii="Times New Roman" w:hAnsi="Times New Roman" w:cs="Times New Roman"/>
+          <w:sz w:val="28"/>
+          <w:szCs w:val="28"/>
+        </w:rPr>
+        <w:t>For banks, bar graphs are used to represent risk metrics such as default probability and expected loss. A pie chart is used to show the distribution between risk and safe categories. These visualizations help banks quickly analyze borrower profiles and make decisions.</w:t>
+      </w:r>
+    </w:p>
+    <w:p>
+      <w:pPr>
+        <w:jc w:val="both"/>
+        <w:rPr>
+          <w:rFonts w:ascii="Times New Roman" w:hAnsi="Times New Roman" w:cs="Times New Roman"/>
+          <w:sz w:val="28"/>
+          <w:szCs w:val="28"/>
+        </w:rPr>
+      </w:pPr>
+      <w:r>
+        <w:rPr>
+          <w:rFonts w:ascii="Times New Roman" w:hAnsi="Times New Roman" w:cs="Times New Roman"/>
+          <w:sz w:val="28"/>
+          <w:szCs w:val="28"/>
+        </w:rPr>
+        <w:t>Bank Charts:</w:t>
+      </w:r>
+    </w:p>
+    <w:p>
+      <w:pPr>
+        <w:numPr>
+          <w:ilvl w:val="0"/>
+          <w:numId w:val="19"/>
+        </w:numPr>
+        <w:jc w:val="both"/>
+        <w:rPr>
+          <w:rFonts w:ascii="Times New Roman" w:hAnsi="Times New Roman" w:cs="Times New Roman"/>
+          <w:sz w:val="28"/>
+          <w:szCs w:val="28"/>
+        </w:rPr>
+      </w:pPr>
+      <w:r>
+        <w:rPr>
+          <w:rFonts w:ascii="Times New Roman" w:hAnsi="Times New Roman" w:cs="Times New Roman"/>
+          <w:sz w:val="28"/>
+          <w:szCs w:val="28"/>
+        </w:rPr>
+        <w:t xml:space="preserve">Bar Graph → Risk analysis </w:t>
+      </w:r>
+    </w:p>
+    <w:p>
+      <w:pPr>
+        <w:numPr>
+          <w:ilvl w:val="0"/>
+          <w:numId w:val="19"/>
+        </w:numPr>
+        <w:jc w:val="both"/>
+        <w:rPr>
+          <w:rFonts w:ascii="Times New Roman" w:hAnsi="Times New Roman" w:cs="Times New Roman"/>
+          <w:sz w:val="28"/>
+          <w:szCs w:val="28"/>
+        </w:rPr>
+      </w:pPr>
+      <w:r>
+        <w:rPr>
+          <w:rFonts w:ascii="Times New Roman" w:hAnsi="Times New Roman" w:cs="Times New Roman"/>
+          <w:sz w:val="28"/>
+          <w:szCs w:val="28"/>
+        </w:rPr>
+        <w:t xml:space="preserve">Pie Chart → Risk distribution </w:t>
+      </w:r>
+    </w:p>
+    <w:p>
+      <w:pPr>
+        <w:numPr>
+          <w:ilvl w:val="0"/>
+          <w:numId w:val="19"/>
+        </w:numPr>
+        <w:jc w:val="both"/>
+        <w:rPr>
+          <w:rFonts w:ascii="Times New Roman" w:hAnsi="Times New Roman" w:cs="Times New Roman"/>
+          <w:sz w:val="28"/>
+          <w:szCs w:val="28"/>
+        </w:rPr>
+      </w:pPr>
+      <w:r>
+        <w:rPr>
+          <w:rFonts w:ascii="Times New Roman" w:hAnsi="Times New Roman" w:cs="Times New Roman"/>
+          <w:sz w:val="28"/>
+          <w:szCs w:val="28"/>
+        </w:rPr>
+        <w:t>Bar Graph → Decision metrics</w:t>
+      </w:r>
+    </w:p>
+    <w:p>
+      <w:pPr>
+        <w:ind w:left="720"/>
+        <w:jc w:val="both"/>
+        <w:rPr>
+          <w:rFonts w:ascii="Times New Roman" w:hAnsi="Times New Roman" w:cs="Times New Roman"/>
+          <w:sz w:val="28"/>
+          <w:szCs w:val="28"/>
+        </w:rPr>
+      </w:pPr>
+    </w:p>
+    <w:p>
+      <w:pPr>
+        <w:ind w:left="720"/>
+        <w:jc w:val="both"/>
+        <w:rPr>
+          <w:rFonts w:ascii="Times New Roman" w:hAnsi="Times New Roman" w:cs="Times New Roman"/>
+          <w:sz w:val="28"/>
+          <w:szCs w:val="28"/>
+        </w:rPr>
+      </w:pPr>
+    </w:p>
+    <w:p>
+      <w:pPr>
+        <w:ind w:left="720"/>
+        <w:jc w:val="both"/>
+        <w:rPr>
+          <w:rFonts w:ascii="Times New Roman" w:hAnsi="Times New Roman" w:cs="Times New Roman"/>
+          <w:sz w:val="28"/>
+          <w:szCs w:val="28"/>
+        </w:rPr>
+      </w:pPr>
+    </w:p>
+    <w:p>
+      <w:pPr>
+        <w:ind w:left="720"/>
+        <w:jc w:val="both"/>
+        <w:rPr>
+          <w:rFonts w:ascii="Times New Roman" w:hAnsi="Times New Roman" w:cs="Times New Roman"/>
+          <w:sz w:val="28"/>
+          <w:szCs w:val="28"/>
+        </w:rPr>
+      </w:pPr>
+    </w:p>
+    <w:p>
+      <w:pPr>
+        <w:ind w:left="720"/>
+        <w:jc w:val="both"/>
+        <w:rPr>
+          <w:rFonts w:ascii="Times New Roman" w:hAnsi="Times New Roman" w:cs="Times New Roman"/>
+          <w:sz w:val="28"/>
+          <w:szCs w:val="28"/>
+        </w:rPr>
+      </w:pPr>
+    </w:p>
+    <w:p>
+      <w:pPr>
+        <w:ind w:left="720"/>
+        <w:jc w:val="both"/>
+        <w:rPr>
+          <w:rFonts w:ascii="Times New Roman" w:hAnsi="Times New Roman" w:cs="Times New Roman"/>
+          <w:sz w:val="28"/>
+          <w:szCs w:val="28"/>
+        </w:rPr>
+      </w:pPr>
+    </w:p>
+    <w:p>
+      <w:pPr>
+        <w:ind w:left="720"/>
+        <w:jc w:val="both"/>
+        <w:rPr>
+          <w:rFonts w:ascii="Times New Roman" w:hAnsi="Times New Roman" w:cs="Times New Roman"/>
+          <w:sz w:val="28"/>
+          <w:szCs w:val="28"/>
+        </w:rPr>
+      </w:pPr>
+    </w:p>
+    <w:p>
+      <w:pPr>
+        <w:ind w:left="720"/>
+        <w:jc w:val="both"/>
+        <w:rPr>
+          <w:rFonts w:ascii="Times New Roman" w:hAnsi="Times New Roman" w:cs="Times New Roman"/>
+          <w:sz w:val="28"/>
+          <w:szCs w:val="28"/>
+        </w:rPr>
+      </w:pPr>
+    </w:p>
+    <w:p>
+      <w:pPr>
+        <w:ind w:left="720"/>
+        <w:jc w:val="both"/>
+        <w:rPr>
+          <w:rFonts w:ascii="Times New Roman" w:hAnsi="Times New Roman" w:cs="Times New Roman"/>
+          <w:sz w:val="28"/>
+          <w:szCs w:val="28"/>
+        </w:rPr>
+      </w:pPr>
+    </w:p>
+    <w:p>
+      <w:pPr>
+        <w:ind w:left="720"/>
         <w:jc w:val="center"/>
         <w:rPr>
           <w:rFonts w:ascii="Times New Roman" w:hAnsi="Times New Roman" w:cs="Times New Roman"/>
@@ -8936,157 +8366,7 @@
     </w:p>
     <w:p>
       <w:pPr>
-        <w:jc w:val="center"/>
-        <w:rPr>
-          <w:rFonts w:ascii="Times New Roman" w:hAnsi="Times New Roman" w:cs="Times New Roman"/>
-          <w:b/>
-          <w:bCs/>
-          <w:sz w:val="32"/>
-          <w:szCs w:val="32"/>
-        </w:rPr>
-      </w:pPr>
-      <w:r>
-        <w:rPr>
-          <w:rFonts w:ascii="Times New Roman" w:hAnsi="Times New Roman" w:cs="Times New Roman"/>
-          <w:b/>
-          <w:bCs/>
-          <w:sz w:val="32"/>
-          <w:szCs w:val="32"/>
-        </w:rPr>
-        <w:t>RESULT</w:t>
-      </w:r>
-    </w:p>
-    <w:p>
-      <w:pPr>
-        <w:jc w:val="both"/>
-        <w:rPr>
-          <w:rFonts w:ascii="Times New Roman" w:hAnsi="Times New Roman" w:cs="Times New Roman"/>
-          <w:sz w:val="28"/>
-          <w:szCs w:val="28"/>
-        </w:rPr>
-      </w:pPr>
-      <w:r>
-        <w:rPr>
-          <w:rFonts w:ascii="Times New Roman" w:hAnsi="Times New Roman" w:cs="Times New Roman"/>
-          <w:sz w:val="28"/>
-          <w:szCs w:val="28"/>
-        </w:rPr>
-        <w:t xml:space="preserve">The </w:t>
-      </w:r>
-      <w:proofErr w:type="spellStart"/>
-      <w:r>
-        <w:rPr>
-          <w:rFonts w:ascii="Times New Roman" w:hAnsi="Times New Roman" w:cs="Times New Roman"/>
-          <w:sz w:val="28"/>
-          <w:szCs w:val="28"/>
-        </w:rPr>
-        <w:t>CreditPath</w:t>
-      </w:r>
-      <w:proofErr w:type="spellEnd"/>
-      <w:r>
-        <w:rPr>
-          <w:rFonts w:ascii="Times New Roman" w:hAnsi="Times New Roman" w:cs="Times New Roman"/>
-          <w:sz w:val="28"/>
-          <w:szCs w:val="28"/>
-        </w:rPr>
-        <w:t xml:space="preserve"> AI system successfully produces accurate and meaningful outputs for both users and banks. The results demonstrate the effectiveness of the system in predicting loan risk and providing actionable insights. </w:t>
-      </w:r>
-    </w:p>
-    <w:p>
-      <w:pPr>
-        <w:jc w:val="both"/>
-        <w:rPr>
-          <w:rFonts w:ascii="Times New Roman" w:hAnsi="Times New Roman" w:cs="Times New Roman"/>
-          <w:sz w:val="28"/>
-          <w:szCs w:val="28"/>
-        </w:rPr>
-      </w:pPr>
-      <w:r>
-        <w:rPr>
-          <w:rFonts w:ascii="Times New Roman" w:hAnsi="Times New Roman" w:cs="Times New Roman"/>
-          <w:sz w:val="28"/>
-          <w:szCs w:val="28"/>
-        </w:rPr>
-        <w:t xml:space="preserve">For users, the system classifies their financial condition into different risk levels such as low, medium, and high. Based on this classification, the system provides recommendations that help users improve their financial stability. For example, users with medium risk are advised to improve their credit score and reduce debt, while high-risk users are advised to avoid applying for loans until their financial condition improves. </w:t>
-      </w:r>
-    </w:p>
-    <w:p>
-      <w:pPr>
-        <w:jc w:val="both"/>
-        <w:rPr>
-          <w:rFonts w:ascii="Times New Roman" w:hAnsi="Times New Roman" w:cs="Times New Roman"/>
-          <w:sz w:val="28"/>
-          <w:szCs w:val="28"/>
-        </w:rPr>
-      </w:pPr>
-      <w:r>
-        <w:rPr>
-          <w:rFonts w:ascii="Times New Roman" w:hAnsi="Times New Roman" w:cs="Times New Roman"/>
-          <w:sz w:val="28"/>
-          <w:szCs w:val="28"/>
-        </w:rPr>
-        <w:t xml:space="preserve">For banks, the system calculates important metrics such as default probability and expected loss. These metrics help banks understand the level of risk associated with a loan. Based on the results, the system suggests whether the loan should be approved, conditionally approved, or rejected. This helps banks make informed decisions and reduce the chances of financial loss. </w:t>
-      </w:r>
-    </w:p>
-    <w:p>
-      <w:pPr>
-        <w:jc w:val="both"/>
-        <w:rPr>
-          <w:rFonts w:ascii="Times New Roman" w:hAnsi="Times New Roman" w:cs="Times New Roman"/>
-          <w:sz w:val="28"/>
-          <w:szCs w:val="28"/>
-        </w:rPr>
-      </w:pPr>
-      <w:r>
-        <w:rPr>
-          <w:rFonts w:ascii="Times New Roman" w:hAnsi="Times New Roman" w:cs="Times New Roman"/>
-          <w:sz w:val="28"/>
-          <w:szCs w:val="28"/>
-        </w:rPr>
-        <w:t xml:space="preserve">The visualization component enhances the understanding of results. Charts such as pie graphs and bar graphs provide a clear representation of risk distribution and financial metrics. This makes it easier for users and banks to interpret the results quickly. </w:t>
-      </w:r>
-    </w:p>
-    <w:p>
-      <w:pPr>
-        <w:jc w:val="both"/>
-        <w:rPr>
-          <w:rFonts w:ascii="Times New Roman" w:hAnsi="Times New Roman" w:cs="Times New Roman"/>
-          <w:sz w:val="28"/>
-          <w:szCs w:val="28"/>
-        </w:rPr>
-      </w:pPr>
-      <w:r>
-        <w:rPr>
-          <w:rFonts w:ascii="Times New Roman" w:hAnsi="Times New Roman" w:cs="Times New Roman"/>
-          <w:sz w:val="28"/>
-          <w:szCs w:val="28"/>
-        </w:rPr>
-        <w:t xml:space="preserve">The system performs efficiently and provides real-time responses. The predictions are consistent with the input data, and the recommendations are relevant and practical. The use of visualization improves user engagement and makes the system more intuitive. </w:t>
-      </w:r>
-    </w:p>
-    <w:p>
-      <w:pPr>
-        <w:rPr>
-          <w:rFonts w:ascii="Times New Roman" w:hAnsi="Times New Roman" w:cs="Times New Roman"/>
-          <w:b/>
-          <w:bCs/>
-          <w:sz w:val="28"/>
-          <w:szCs w:val="28"/>
-        </w:rPr>
-      </w:pPr>
-      <w:r>
-        <w:rPr>
-          <w:rFonts w:ascii="Times New Roman" w:hAnsi="Times New Roman" w:cs="Times New Roman"/>
-          <w:b/>
-          <w:bCs/>
-          <w:sz w:val="28"/>
-          <w:szCs w:val="28"/>
-        </w:rPr>
-        <w:t xml:space="preserve">User output </w:t>
-      </w:r>
-    </w:p>
-    <w:p>
-      <w:pPr>
+        <w:jc w:val="both"/>
         <w:rPr>
           <w:rFonts w:ascii="Times New Roman" w:hAnsi="Times New Roman" w:cs="Times New Roman"/>
           <w:sz w:val="28"/>
@@ -9101,10 +8381,10 @@
           <w:szCs w:val="28"/>
         </w:rPr>
         <w:drawing>
-          <wp:inline distT="0" distB="0" distL="0" distR="0" wp14:anchorId="5ABD462B" wp14:editId="4A14AE92">
+          <wp:inline distT="0" distB="0" distL="0" distR="0" wp14:anchorId="6770A248" wp14:editId="7B31C5AE">
             <wp:extent cx="6640195" cy="3526790"/>
             <wp:effectExtent l="0" t="0" r="8255" b="0"/>
-            <wp:docPr id="591523644" name="Picture 2"/>
+            <wp:docPr id="2077812381" name="Picture 19"/>
             <wp:cNvGraphicFramePr>
               <a:graphicFrameLocks xmlns:a="http://schemas.openxmlformats.org/drawingml/2006/main" noChangeAspect="1"/>
             </wp:cNvGraphicFramePr>
@@ -9112,7 +8392,7 @@
               <a:graphicData uri="http://schemas.openxmlformats.org/drawingml/2006/picture">
                 <pic:pic xmlns:pic="http://schemas.openxmlformats.org/drawingml/2006/picture">
                   <pic:nvPicPr>
-                    <pic:cNvPr id="0" name="Picture 284"/>
+                    <pic:cNvPr id="0" name="Picture 301"/>
                     <pic:cNvPicPr>
                       <a:picLocks noChangeAspect="1" noChangeArrowheads="1"/>
                     </pic:cNvPicPr>
@@ -9152,6 +8432,194 @@
     </w:p>
     <w:p>
       <w:pPr>
+        <w:jc w:val="both"/>
+        <w:rPr>
+          <w:rFonts w:ascii="Times New Roman" w:hAnsi="Times New Roman" w:cs="Times New Roman"/>
+          <w:sz w:val="28"/>
+          <w:szCs w:val="28"/>
+        </w:rPr>
+      </w:pPr>
+    </w:p>
+    <w:p>
+      <w:pPr>
+        <w:jc w:val="both"/>
+        <w:rPr>
+          <w:rFonts w:ascii="Times New Roman" w:hAnsi="Times New Roman" w:cs="Times New Roman"/>
+          <w:b/>
+          <w:bCs/>
+          <w:sz w:val="28"/>
+          <w:szCs w:val="28"/>
+        </w:rPr>
+      </w:pPr>
+      <w:r>
+        <w:rPr>
+          <w:rFonts w:ascii="Times New Roman" w:hAnsi="Times New Roman" w:cs="Times New Roman"/>
+          <w:b/>
+          <w:bCs/>
+          <w:sz w:val="28"/>
+          <w:szCs w:val="28"/>
+        </w:rPr>
+        <w:t>4</w:t>
+      </w:r>
+      <w:r>
+        <w:rPr>
+          <w:rFonts w:ascii="Times New Roman" w:hAnsi="Times New Roman" w:cs="Times New Roman"/>
+          <w:b/>
+          <w:bCs/>
+          <w:sz w:val="28"/>
+          <w:szCs w:val="28"/>
+        </w:rPr>
+        <w:t>.7 API Integration Flow</w:t>
+      </w:r>
+    </w:p>
+    <w:p>
+      <w:pPr>
+        <w:jc w:val="both"/>
+        <w:rPr>
+          <w:rFonts w:ascii="Times New Roman" w:hAnsi="Times New Roman" w:cs="Times New Roman"/>
+          <w:b/>
+          <w:bCs/>
+          <w:sz w:val="28"/>
+          <w:szCs w:val="28"/>
+        </w:rPr>
+      </w:pPr>
+      <w:r>
+        <w:rPr>
+          <w:rFonts w:ascii="Times New Roman" w:hAnsi="Times New Roman" w:cs="Times New Roman"/>
+          <w:b/>
+          <w:bCs/>
+          <w:sz w:val="28"/>
+          <w:szCs w:val="28"/>
+        </w:rPr>
+        <w:t>Axios Request</w:t>
+      </w:r>
+    </w:p>
+    <w:p>
+      <w:pPr>
+        <w:jc w:val="both"/>
+        <w:rPr>
+          <w:rFonts w:ascii="Times New Roman" w:hAnsi="Times New Roman" w:cs="Times New Roman"/>
+          <w:sz w:val="28"/>
+          <w:szCs w:val="28"/>
+        </w:rPr>
+      </w:pPr>
+      <w:r>
+        <w:rPr>
+          <w:rFonts w:ascii="Times New Roman" w:hAnsi="Times New Roman" w:cs="Times New Roman"/>
+          <w:sz w:val="28"/>
+          <w:szCs w:val="28"/>
+        </w:rPr>
+        <w:t>When the user submits input data, the frontend sends a request to the backend using Axios. The data is formatted into JSON and sent to the appropriate API endpoint.</w:t>
+      </w:r>
+    </w:p>
+    <w:p>
+      <w:pPr>
+        <w:jc w:val="both"/>
+        <w:rPr>
+          <w:rFonts w:ascii="Times New Roman" w:hAnsi="Times New Roman" w:cs="Times New Roman"/>
+          <w:sz w:val="28"/>
+          <w:szCs w:val="28"/>
+        </w:rPr>
+      </w:pPr>
+    </w:p>
+    <w:p>
+      <w:pPr>
+        <w:jc w:val="both"/>
+        <w:rPr>
+          <w:rFonts w:ascii="Times New Roman" w:hAnsi="Times New Roman" w:cs="Times New Roman"/>
+          <w:b/>
+          <w:bCs/>
+          <w:sz w:val="28"/>
+          <w:szCs w:val="28"/>
+        </w:rPr>
+      </w:pPr>
+      <w:r>
+        <w:rPr>
+          <w:rFonts w:ascii="Times New Roman" w:hAnsi="Times New Roman" w:cs="Times New Roman"/>
+          <w:b/>
+          <w:bCs/>
+          <w:sz w:val="28"/>
+          <w:szCs w:val="28"/>
+        </w:rPr>
+        <w:t>Backend Response</w:t>
+      </w:r>
+    </w:p>
+    <w:p>
+      <w:pPr>
+        <w:jc w:val="both"/>
+        <w:rPr>
+          <w:rFonts w:ascii="Times New Roman" w:hAnsi="Times New Roman" w:cs="Times New Roman"/>
+          <w:sz w:val="28"/>
+          <w:szCs w:val="28"/>
+        </w:rPr>
+      </w:pPr>
+      <w:r>
+        <w:rPr>
+          <w:rFonts w:ascii="Times New Roman" w:hAnsi="Times New Roman" w:cs="Times New Roman"/>
+          <w:sz w:val="28"/>
+          <w:szCs w:val="28"/>
+        </w:rPr>
+        <w:t>The backend processes the request and returns the output in JSON format. This output includes risk levels, recommendations, and other relevant metrics.</w:t>
+      </w:r>
+    </w:p>
+    <w:p>
+      <w:pPr>
+        <w:jc w:val="both"/>
+        <w:rPr>
+          <w:rFonts w:ascii="Times New Roman" w:hAnsi="Times New Roman" w:cs="Times New Roman"/>
+          <w:sz w:val="28"/>
+          <w:szCs w:val="28"/>
+        </w:rPr>
+      </w:pPr>
+    </w:p>
+    <w:p>
+      <w:pPr>
+        <w:jc w:val="both"/>
+        <w:rPr>
+          <w:rFonts w:ascii="Times New Roman" w:hAnsi="Times New Roman" w:cs="Times New Roman"/>
+          <w:b/>
+          <w:bCs/>
+          <w:sz w:val="28"/>
+          <w:szCs w:val="28"/>
+        </w:rPr>
+      </w:pPr>
+      <w:r>
+        <w:rPr>
+          <w:rFonts w:ascii="Times New Roman" w:hAnsi="Times New Roman" w:cs="Times New Roman"/>
+          <w:b/>
+          <w:bCs/>
+          <w:sz w:val="28"/>
+          <w:szCs w:val="28"/>
+        </w:rPr>
+        <w:t>Rendering</w:t>
+      </w:r>
+    </w:p>
+    <w:p>
+      <w:pPr>
+        <w:jc w:val="both"/>
+        <w:rPr>
+          <w:rFonts w:ascii="Times New Roman" w:hAnsi="Times New Roman" w:cs="Times New Roman"/>
+          <w:sz w:val="28"/>
+          <w:szCs w:val="28"/>
+        </w:rPr>
+      </w:pPr>
+      <w:r>
+        <w:rPr>
+          <w:rFonts w:ascii="Times New Roman" w:hAnsi="Times New Roman" w:cs="Times New Roman"/>
+          <w:sz w:val="28"/>
+          <w:szCs w:val="28"/>
+        </w:rPr>
+        <w:t>The frontend receives the response and dynamically displays the results. Charts and text outputs are rendered based on the received data, providing a complete view of the prediction.</w:t>
+      </w:r>
+    </w:p>
+    <w:p/>
+    <w:p>
+      <w:r>
+        <w:br w:type="page"/>
+      </w:r>
+    </w:p>
+    <w:p>
+      <w:pPr>
         <w:jc w:val="center"/>
         <w:rPr>
           <w:rFonts w:ascii="Times New Roman" w:hAnsi="Times New Roman" w:cs="Times New Roman"/>
@@ -9186,13 +8654,137 @@
       </w:pPr>
       <w:r>
         <w:rPr>
+          <w:rFonts w:ascii="Times New Roman" w:hAnsi="Times New Roman" w:cs="Times New Roman"/>
+          <w:b/>
+          <w:bCs/>
+          <w:sz w:val="32"/>
+          <w:szCs w:val="32"/>
+        </w:rPr>
+        <w:t>RESULT</w:t>
+      </w:r>
+    </w:p>
+    <w:p>
+      <w:pPr>
+        <w:jc w:val="both"/>
+        <w:rPr>
+          <w:rFonts w:ascii="Times New Roman" w:hAnsi="Times New Roman" w:cs="Times New Roman"/>
+          <w:sz w:val="28"/>
+          <w:szCs w:val="28"/>
+        </w:rPr>
+      </w:pPr>
+      <w:r>
+        <w:rPr>
+          <w:rFonts w:ascii="Times New Roman" w:hAnsi="Times New Roman" w:cs="Times New Roman"/>
+          <w:sz w:val="28"/>
+          <w:szCs w:val="28"/>
+        </w:rPr>
+        <w:t xml:space="preserve">The CreditPath AI system successfully produces accurate and meaningful outputs for both users and banks. The results demonstrate the effectiveness of the system in predicting loan risk and providing actionable insights. </w:t>
+      </w:r>
+    </w:p>
+    <w:p>
+      <w:pPr>
+        <w:jc w:val="both"/>
+        <w:rPr>
+          <w:rFonts w:ascii="Times New Roman" w:hAnsi="Times New Roman" w:cs="Times New Roman"/>
+          <w:sz w:val="28"/>
+          <w:szCs w:val="28"/>
+        </w:rPr>
+      </w:pPr>
+      <w:r>
+        <w:rPr>
+          <w:rFonts w:ascii="Times New Roman" w:hAnsi="Times New Roman" w:cs="Times New Roman"/>
+          <w:sz w:val="28"/>
+          <w:szCs w:val="28"/>
+        </w:rPr>
+        <w:t xml:space="preserve">For users, the system classifies their financial condition into different risk levels such as low, medium, and high. Based on this classification, the system provides recommendations that help users improve their financial stability. For example, users with medium risk are advised to improve their credit score and reduce debt, while high-risk users are advised to avoid applying for loans until their financial condition improves. </w:t>
+      </w:r>
+    </w:p>
+    <w:p>
+      <w:pPr>
+        <w:jc w:val="both"/>
+        <w:rPr>
+          <w:rFonts w:ascii="Times New Roman" w:hAnsi="Times New Roman" w:cs="Times New Roman"/>
+          <w:sz w:val="28"/>
+          <w:szCs w:val="28"/>
+        </w:rPr>
+      </w:pPr>
+      <w:r>
+        <w:rPr>
+          <w:rFonts w:ascii="Times New Roman" w:hAnsi="Times New Roman" w:cs="Times New Roman"/>
+          <w:sz w:val="28"/>
+          <w:szCs w:val="28"/>
+        </w:rPr>
+        <w:t xml:space="preserve">For banks, the system calculates important metrics such as default probability and expected loss. These metrics help banks understand the level of risk associated with a loan. Based on the results, the system suggests whether the loan should be approved, conditionally approved, or rejected. This helps banks make informed decisions and reduce the chances of financial loss. </w:t>
+      </w:r>
+    </w:p>
+    <w:p>
+      <w:pPr>
+        <w:jc w:val="both"/>
+        <w:rPr>
+          <w:rFonts w:ascii="Times New Roman" w:hAnsi="Times New Roman" w:cs="Times New Roman"/>
+          <w:sz w:val="28"/>
+          <w:szCs w:val="28"/>
+        </w:rPr>
+      </w:pPr>
+      <w:r>
+        <w:rPr>
+          <w:rFonts w:ascii="Times New Roman" w:hAnsi="Times New Roman" w:cs="Times New Roman"/>
+          <w:sz w:val="28"/>
+          <w:szCs w:val="28"/>
+        </w:rPr>
+        <w:t xml:space="preserve">The visualization component enhances the understanding of results. Charts such as pie graphs and bar graphs provide a clear representation of risk distribution and financial metrics. This makes it easier for users and banks to interpret the results quickly. </w:t>
+      </w:r>
+    </w:p>
+    <w:p>
+      <w:pPr>
+        <w:jc w:val="both"/>
+        <w:rPr>
+          <w:rFonts w:ascii="Times New Roman" w:hAnsi="Times New Roman" w:cs="Times New Roman"/>
+          <w:sz w:val="28"/>
+          <w:szCs w:val="28"/>
+        </w:rPr>
+      </w:pPr>
+      <w:r>
+        <w:rPr>
+          <w:rFonts w:ascii="Times New Roman" w:hAnsi="Times New Roman" w:cs="Times New Roman"/>
+          <w:sz w:val="28"/>
+          <w:szCs w:val="28"/>
+        </w:rPr>
+        <w:t xml:space="preserve">The system performs efficiently and provides real-time responses. The predictions are consistent with the input data, and the recommendations are relevant and practical. The use of visualization improves user engagement and makes the system more intuitive. </w:t>
+      </w:r>
+    </w:p>
+    <w:p>
+      <w:pPr>
+        <w:rPr>
+          <w:rFonts w:ascii="Times New Roman" w:hAnsi="Times New Roman" w:cs="Times New Roman"/>
+          <w:b/>
+          <w:bCs/>
+          <w:sz w:val="28"/>
+          <w:szCs w:val="28"/>
+        </w:rPr>
+      </w:pPr>
+      <w:r>
+        <w:rPr>
+          <w:rFonts w:ascii="Times New Roman" w:hAnsi="Times New Roman" w:cs="Times New Roman"/>
+          <w:b/>
+          <w:bCs/>
+          <w:sz w:val="28"/>
+          <w:szCs w:val="28"/>
+        </w:rPr>
+        <w:t xml:space="preserve">User output </w:t>
+      </w:r>
+      <w:r>
+        <w:rPr>
+          <w:rFonts w:ascii="Times New Roman" w:hAnsi="Times New Roman" w:cs="Times New Roman"/>
           <w:noProof/>
+          <w:sz w:val="28"/>
+          <w:szCs w:val="28"/>
         </w:rPr>
         <w:drawing>
-          <wp:inline distT="0" distB="0" distL="0" distR="0" wp14:anchorId="7A6E159B" wp14:editId="23D4FE70">
-            <wp:extent cx="6639673" cy="3570514"/>
+          <wp:inline distT="0" distB="0" distL="0" distR="0" wp14:anchorId="54581988" wp14:editId="60B6B7C7">
+            <wp:extent cx="6637020" cy="3733800"/>
             <wp:effectExtent l="0" t="0" r="0" b="0"/>
-            <wp:docPr id="1005980528" name="Picture 4"/>
+            <wp:docPr id="26120311" name="Picture 3"/>
             <wp:cNvGraphicFramePr>
               <a:graphicFrameLocks xmlns:a="http://schemas.openxmlformats.org/drawingml/2006/main" noChangeAspect="1"/>
             </wp:cNvGraphicFramePr>
@@ -9200,7 +8792,7 @@
               <a:graphicData uri="http://schemas.openxmlformats.org/drawingml/2006/picture">
                 <pic:pic xmlns:pic="http://schemas.openxmlformats.org/drawingml/2006/picture">
                   <pic:nvPicPr>
-                    <pic:cNvPr id="0" name="Picture 286"/>
+                    <pic:cNvPr id="0" name="Picture 3"/>
                     <pic:cNvPicPr>
                       <a:picLocks noChangeAspect="1" noChangeArrowheads="1"/>
                     </pic:cNvPicPr>
@@ -9221,7 +8813,7 @@
                   <pic:spPr bwMode="auto">
                     <a:xfrm>
                       <a:off x="0" y="0"/>
-                      <a:ext cx="6659010" cy="3580913"/>
+                      <a:ext cx="6637020" cy="3733800"/>
                     </a:xfrm>
                     <a:prstGeom prst="rect">
                       <a:avLst/>
@@ -9249,10 +8841,20 @@
           <w:szCs w:val="32"/>
         </w:rPr>
       </w:pPr>
-    </w:p>
-    <w:p>
-      <w:pPr>
-        <w:jc w:val="center"/>
+      <w:r>
+        <w:rPr>
+          <w:rFonts w:ascii="Times New Roman" w:hAnsi="Times New Roman" w:cs="Times New Roman"/>
+          <w:b/>
+          <w:bCs/>
+          <w:sz w:val="32"/>
+          <w:szCs w:val="32"/>
+        </w:rPr>
+        <w:lastRenderedPageBreak/>
+        <w:t>21</w:t>
+      </w:r>
+    </w:p>
+    <w:p>
+      <w:pPr>
         <w:rPr>
           <w:rFonts w:ascii="Times New Roman" w:hAnsi="Times New Roman" w:cs="Times New Roman"/>
           <w:b/>
@@ -9271,10 +8873,10 @@
           <w:szCs w:val="32"/>
         </w:rPr>
         <w:drawing>
-          <wp:inline distT="0" distB="0" distL="0" distR="0" wp14:anchorId="693B6CCE" wp14:editId="6681FD08">
-            <wp:extent cx="6640195" cy="3526790"/>
-            <wp:effectExtent l="0" t="0" r="8255" b="0"/>
-            <wp:docPr id="398782744" name="Picture 5"/>
+          <wp:inline distT="0" distB="0" distL="0" distR="0" wp14:anchorId="4AB6874C" wp14:editId="6F31B341">
+            <wp:extent cx="6637020" cy="3733800"/>
+            <wp:effectExtent l="0" t="0" r="0" b="0"/>
+            <wp:docPr id="86978012" name="Picture 4"/>
             <wp:cNvGraphicFramePr>
               <a:graphicFrameLocks xmlns:a="http://schemas.openxmlformats.org/drawingml/2006/main" noChangeAspect="1"/>
             </wp:cNvGraphicFramePr>
@@ -9282,7 +8884,7 @@
               <a:graphicData uri="http://schemas.openxmlformats.org/drawingml/2006/picture">
                 <pic:pic xmlns:pic="http://schemas.openxmlformats.org/drawingml/2006/picture">
                   <pic:nvPicPr>
-                    <pic:cNvPr id="0" name="Picture 287"/>
+                    <pic:cNvPr id="0" name="Picture 4"/>
                     <pic:cNvPicPr>
                       <a:picLocks noChangeAspect="1" noChangeArrowheads="1"/>
                     </pic:cNvPicPr>
@@ -9303,7 +8905,7 @@
                   <pic:spPr bwMode="auto">
                     <a:xfrm>
                       <a:off x="0" y="0"/>
-                      <a:ext cx="6640195" cy="3526790"/>
+                      <a:ext cx="6637020" cy="3733800"/>
                     </a:xfrm>
                     <a:prstGeom prst="rect">
                       <a:avLst/>
@@ -9334,75 +8936,6 @@
     </w:p>
     <w:p>
       <w:pPr>
-        <w:jc w:val="center"/>
-        <w:rPr>
-          <w:rFonts w:ascii="Times New Roman" w:hAnsi="Times New Roman" w:cs="Times New Roman"/>
-          <w:b/>
-          <w:bCs/>
-          <w:sz w:val="32"/>
-          <w:szCs w:val="32"/>
-        </w:rPr>
-      </w:pPr>
-    </w:p>
-    <w:p>
-      <w:pPr>
-        <w:jc w:val="center"/>
-        <w:rPr>
-          <w:rFonts w:ascii="Times New Roman" w:hAnsi="Times New Roman" w:cs="Times New Roman"/>
-          <w:b/>
-          <w:bCs/>
-          <w:sz w:val="32"/>
-          <w:szCs w:val="32"/>
-        </w:rPr>
-      </w:pPr>
-    </w:p>
-    <w:p>
-      <w:pPr>
-        <w:jc w:val="center"/>
-        <w:rPr>
-          <w:rFonts w:ascii="Times New Roman" w:hAnsi="Times New Roman" w:cs="Times New Roman"/>
-          <w:b/>
-          <w:bCs/>
-          <w:sz w:val="32"/>
-          <w:szCs w:val="32"/>
-        </w:rPr>
-      </w:pPr>
-    </w:p>
-    <w:p>
-      <w:pPr>
-        <w:jc w:val="center"/>
-        <w:rPr>
-          <w:rFonts w:ascii="Times New Roman" w:hAnsi="Times New Roman" w:cs="Times New Roman"/>
-          <w:b/>
-          <w:bCs/>
-          <w:sz w:val="32"/>
-          <w:szCs w:val="32"/>
-        </w:rPr>
-      </w:pPr>
-      <w:r>
-        <w:rPr>
-          <w:rFonts w:ascii="Times New Roman" w:hAnsi="Times New Roman" w:cs="Times New Roman"/>
-          <w:b/>
-          <w:bCs/>
-          <w:sz w:val="32"/>
-          <w:szCs w:val="32"/>
-        </w:rPr>
-        <w:lastRenderedPageBreak/>
-        <w:t>21</w:t>
-      </w:r>
-    </w:p>
-    <w:p>
-      <w:pPr>
-        <w:jc w:val="center"/>
-        <w:rPr>
-          <w:rFonts w:ascii="Times New Roman" w:hAnsi="Times New Roman" w:cs="Times New Roman"/>
-          <w:b/>
-          <w:bCs/>
-          <w:sz w:val="32"/>
-          <w:szCs w:val="32"/>
-        </w:rPr>
-      </w:pPr>
-      <w:r>
         <w:rPr>
           <w:rFonts w:ascii="Times New Roman" w:hAnsi="Times New Roman" w:cs="Times New Roman"/>
           <w:b/>
@@ -9411,11 +8944,21 @@
           <w:sz w:val="32"/>
           <w:szCs w:val="32"/>
         </w:rPr>
+      </w:pPr>
+      <w:r>
+        <w:rPr>
+          <w:rFonts w:ascii="Times New Roman" w:hAnsi="Times New Roman" w:cs="Times New Roman"/>
+          <w:b/>
+          <w:bCs/>
+          <w:noProof/>
+          <w:sz w:val="32"/>
+          <w:szCs w:val="32"/>
+        </w:rPr>
         <w:drawing>
-          <wp:inline distT="0" distB="0" distL="0" distR="0" wp14:anchorId="596584F9" wp14:editId="440DE866">
-            <wp:extent cx="6640195" cy="3526790"/>
-            <wp:effectExtent l="0" t="0" r="8255" b="0"/>
-            <wp:docPr id="352638814" name="Picture 6"/>
+          <wp:inline distT="0" distB="0" distL="0" distR="0" wp14:anchorId="458902A6" wp14:editId="315A45BA">
+            <wp:extent cx="6637020" cy="3733800"/>
+            <wp:effectExtent l="0" t="0" r="0" b="0"/>
+            <wp:docPr id="1039860417" name="Picture 5"/>
             <wp:cNvGraphicFramePr>
               <a:graphicFrameLocks xmlns:a="http://schemas.openxmlformats.org/drawingml/2006/main" noChangeAspect="1"/>
             </wp:cNvGraphicFramePr>
@@ -9423,7 +8966,7 @@
               <a:graphicData uri="http://schemas.openxmlformats.org/drawingml/2006/picture">
                 <pic:pic xmlns:pic="http://schemas.openxmlformats.org/drawingml/2006/picture">
                   <pic:nvPicPr>
-                    <pic:cNvPr id="0" name="Picture 288"/>
+                    <pic:cNvPr id="0" name="Picture 5"/>
                     <pic:cNvPicPr>
                       <a:picLocks noChangeAspect="1" noChangeArrowheads="1"/>
                     </pic:cNvPicPr>
@@ -9444,7 +8987,7 @@
                   <pic:spPr bwMode="auto">
                     <a:xfrm>
                       <a:off x="0" y="0"/>
-                      <a:ext cx="6640195" cy="3526790"/>
+                      <a:ext cx="6637020" cy="3733800"/>
                     </a:xfrm>
                     <a:prstGeom prst="rect">
                       <a:avLst/>
@@ -9463,10 +9006,12 @@
     </w:p>
     <w:p>
       <w:pPr>
-        <w:rPr>
-          <w:rFonts w:ascii="Times New Roman" w:hAnsi="Times New Roman" w:cs="Times New Roman"/>
-          <w:b/>
-          <w:bCs/>
+        <w:jc w:val="center"/>
+        <w:rPr>
+          <w:rFonts w:ascii="Times New Roman" w:hAnsi="Times New Roman" w:cs="Times New Roman"/>
+          <w:b/>
+          <w:bCs/>
+          <w:noProof/>
           <w:sz w:val="32"/>
           <w:szCs w:val="32"/>
         </w:rPr>
@@ -9474,15 +9019,19 @@
     </w:p>
     <w:p>
       <w:pPr>
-        <w:rPr>
-          <w:rFonts w:ascii="Times New Roman" w:hAnsi="Times New Roman" w:cs="Times New Roman"/>
-          <w:b/>
-          <w:bCs/>
+        <w:jc w:val="center"/>
+        <w:rPr>
+          <w:rFonts w:ascii="Times New Roman" w:hAnsi="Times New Roman" w:cs="Times New Roman"/>
+          <w:b/>
+          <w:bCs/>
+          <w:noProof/>
           <w:sz w:val="32"/>
           <w:szCs w:val="32"/>
         </w:rPr>
       </w:pPr>
-      <w:r>
+    </w:p>
+    <w:p>
+      <w:pPr>
         <w:rPr>
           <w:rFonts w:ascii="Times New Roman" w:hAnsi="Times New Roman" w:cs="Times New Roman"/>
           <w:b/>
@@ -9490,8 +9039,7 @@
           <w:sz w:val="32"/>
           <w:szCs w:val="32"/>
         </w:rPr>
-        <w:t>Bank output</w:t>
-      </w:r>
+      </w:pPr>
     </w:p>
     <w:p>
       <w:pPr>
@@ -9506,13 +9054,57 @@
       </w:pPr>
       <w:r>
         <w:rPr>
+          <w:rFonts w:ascii="Times New Roman" w:hAnsi="Times New Roman" w:cs="Times New Roman"/>
+          <w:b/>
+          <w:bCs/>
+          <w:sz w:val="32"/>
+          <w:szCs w:val="32"/>
+        </w:rPr>
+        <w:lastRenderedPageBreak/>
+        <w:t>22</w:t>
+      </w:r>
+    </w:p>
+    <w:p>
+      <w:pPr>
+        <w:rPr>
+          <w:rFonts w:ascii="Times New Roman" w:hAnsi="Times New Roman" w:cs="Times New Roman"/>
+          <w:b/>
+          <w:bCs/>
+          <w:sz w:val="32"/>
+          <w:szCs w:val="32"/>
+        </w:rPr>
+      </w:pPr>
+      <w:r>
+        <w:rPr>
+          <w:rFonts w:ascii="Times New Roman" w:hAnsi="Times New Roman" w:cs="Times New Roman"/>
+          <w:b/>
+          <w:bCs/>
+          <w:sz w:val="32"/>
+          <w:szCs w:val="32"/>
+        </w:rPr>
+        <w:t>Bank output</w:t>
+      </w:r>
+    </w:p>
+    <w:p>
+      <w:pPr>
+        <w:jc w:val="center"/>
+        <w:rPr>
+          <w:rFonts w:ascii="Times New Roman" w:hAnsi="Times New Roman" w:cs="Times New Roman"/>
+          <w:b/>
+          <w:bCs/>
+          <w:sz w:val="32"/>
+          <w:szCs w:val="32"/>
+        </w:rPr>
+      </w:pPr>
+      <w:r>
+        <w:rPr>
           <w:noProof/>
         </w:rPr>
         <w:drawing>
-          <wp:inline distT="0" distB="0" distL="0" distR="0" wp14:anchorId="130B0FC3" wp14:editId="2A686C34">
-            <wp:extent cx="6640195" cy="3526790"/>
-            <wp:effectExtent l="0" t="0" r="8255" b="0"/>
-            <wp:docPr id="906933549" name="Picture 1"/>
+          <wp:inline distT="0" distB="0" distL="0" distR="0" wp14:anchorId="693A2C51" wp14:editId="7810C3AE">
+            <wp:extent cx="6637020" cy="3733800"/>
+            <wp:effectExtent l="0" t="0" r="0" b="0"/>
+            <wp:docPr id="90451255" name="Picture 6"/>
             <wp:cNvGraphicFramePr>
               <a:graphicFrameLocks xmlns:a="http://schemas.openxmlformats.org/drawingml/2006/main" noChangeAspect="1"/>
             </wp:cNvGraphicFramePr>
@@ -9520,7 +9112,7 @@
               <a:graphicData uri="http://schemas.openxmlformats.org/drawingml/2006/picture">
                 <pic:pic xmlns:pic="http://schemas.openxmlformats.org/drawingml/2006/picture">
                   <pic:nvPicPr>
-                    <pic:cNvPr id="0" name="Picture 283"/>
+                    <pic:cNvPr id="0" name="Picture 6"/>
                     <pic:cNvPicPr>
                       <a:picLocks noChangeAspect="1" noChangeArrowheads="1"/>
                     </pic:cNvPicPr>
@@ -9541,7 +9133,7 @@
                   <pic:spPr bwMode="auto">
                     <a:xfrm>
                       <a:off x="0" y="0"/>
-                      <a:ext cx="6640195" cy="3526790"/>
+                      <a:ext cx="6637020" cy="3733800"/>
                     </a:xfrm>
                     <a:prstGeom prst="rect">
                       <a:avLst/>
@@ -9572,54 +9164,6 @@
     </w:p>
     <w:p>
       <w:pPr>
-        <w:jc w:val="center"/>
-        <w:rPr>
-          <w:rFonts w:ascii="Times New Roman" w:hAnsi="Times New Roman" w:cs="Times New Roman"/>
-          <w:b/>
-          <w:bCs/>
-          <w:sz w:val="32"/>
-          <w:szCs w:val="32"/>
-        </w:rPr>
-      </w:pPr>
-    </w:p>
-    <w:p>
-      <w:pPr>
-        <w:jc w:val="center"/>
-        <w:rPr>
-          <w:rFonts w:ascii="Times New Roman" w:hAnsi="Times New Roman" w:cs="Times New Roman"/>
-          <w:b/>
-          <w:bCs/>
-          <w:sz w:val="32"/>
-          <w:szCs w:val="32"/>
-        </w:rPr>
-      </w:pPr>
-    </w:p>
-    <w:p>
-      <w:pPr>
-        <w:jc w:val="center"/>
-        <w:rPr>
-          <w:rFonts w:ascii="Times New Roman" w:hAnsi="Times New Roman" w:cs="Times New Roman"/>
-          <w:b/>
-          <w:bCs/>
-          <w:sz w:val="32"/>
-          <w:szCs w:val="32"/>
-        </w:rPr>
-      </w:pPr>
-      <w:r>
-        <w:rPr>
-          <w:rFonts w:ascii="Times New Roman" w:hAnsi="Times New Roman" w:cs="Times New Roman"/>
-          <w:b/>
-          <w:bCs/>
-          <w:sz w:val="32"/>
-          <w:szCs w:val="32"/>
-        </w:rPr>
-        <w:lastRenderedPageBreak/>
-        <w:t>22</w:t>
-      </w:r>
-    </w:p>
-    <w:p>
-      <w:pPr>
-        <w:jc w:val="center"/>
         <w:rPr>
           <w:rFonts w:ascii="Times New Roman" w:hAnsi="Times New Roman" w:cs="Times New Roman"/>
           <w:b/>
@@ -9638,10 +9182,10 @@
           <w:szCs w:val="32"/>
         </w:rPr>
         <w:drawing>
-          <wp:inline distT="0" distB="0" distL="0" distR="0" wp14:anchorId="41DEE51D" wp14:editId="2C18B507">
-            <wp:extent cx="6640195" cy="3526790"/>
-            <wp:effectExtent l="0" t="0" r="8255" b="0"/>
-            <wp:docPr id="400998806" name="Picture 7"/>
+          <wp:inline distT="0" distB="0" distL="0" distR="0" wp14:anchorId="3833C5E6" wp14:editId="17A034A8">
+            <wp:extent cx="6637020" cy="3733800"/>
+            <wp:effectExtent l="0" t="0" r="0" b="0"/>
+            <wp:docPr id="325086093" name="Picture 7"/>
             <wp:cNvGraphicFramePr>
               <a:graphicFrameLocks xmlns:a="http://schemas.openxmlformats.org/drawingml/2006/main" noChangeAspect="1"/>
             </wp:cNvGraphicFramePr>
@@ -9649,7 +9193,7 @@
               <a:graphicData uri="http://schemas.openxmlformats.org/drawingml/2006/picture">
                 <pic:pic xmlns:pic="http://schemas.openxmlformats.org/drawingml/2006/picture">
                   <pic:nvPicPr>
-                    <pic:cNvPr id="0" name="Picture 289"/>
+                    <pic:cNvPr id="0" name="Picture 7"/>
                     <pic:cNvPicPr>
                       <a:picLocks noChangeAspect="1" noChangeArrowheads="1"/>
                     </pic:cNvPicPr>
@@ -9670,7 +9214,7 @@
                   <pic:spPr bwMode="auto">
                     <a:xfrm>
                       <a:off x="0" y="0"/>
-                      <a:ext cx="6640195" cy="3526790"/>
+                      <a:ext cx="6637020" cy="3733800"/>
                     </a:xfrm>
                     <a:prstGeom prst="rect">
                       <a:avLst/>
@@ -9710,6 +9254,40 @@
           <w:szCs w:val="32"/>
         </w:rPr>
       </w:pPr>
+    </w:p>
+    <w:p>
+      <w:pPr>
+        <w:jc w:val="center"/>
+        <w:rPr>
+          <w:rFonts w:ascii="Times New Roman" w:hAnsi="Times New Roman" w:cs="Times New Roman"/>
+          <w:b/>
+          <w:bCs/>
+          <w:sz w:val="32"/>
+          <w:szCs w:val="32"/>
+        </w:rPr>
+      </w:pPr>
+      <w:r>
+        <w:rPr>
+          <w:rFonts w:ascii="Times New Roman" w:hAnsi="Times New Roman" w:cs="Times New Roman"/>
+          <w:b/>
+          <w:bCs/>
+          <w:sz w:val="32"/>
+          <w:szCs w:val="32"/>
+        </w:rPr>
+        <w:lastRenderedPageBreak/>
+        <w:t>23</w:t>
+      </w:r>
+    </w:p>
+    <w:p>
+      <w:pPr>
+        <w:rPr>
+          <w:rFonts w:ascii="Times New Roman" w:hAnsi="Times New Roman" w:cs="Times New Roman"/>
+          <w:b/>
+          <w:bCs/>
+          <w:sz w:val="32"/>
+          <w:szCs w:val="32"/>
+        </w:rPr>
+      </w:pPr>
       <w:r>
         <w:rPr>
           <w:rFonts w:ascii="Times New Roman" w:hAnsi="Times New Roman" w:cs="Times New Roman"/>
@@ -9720,10 +9298,10 @@
           <w:szCs w:val="32"/>
         </w:rPr>
         <w:drawing>
-          <wp:inline distT="0" distB="0" distL="0" distR="0" wp14:anchorId="34700307" wp14:editId="5889734A">
-            <wp:extent cx="6640195" cy="3526790"/>
-            <wp:effectExtent l="0" t="0" r="8255" b="0"/>
-            <wp:docPr id="1659131090" name="Picture 8"/>
+          <wp:inline distT="0" distB="0" distL="0" distR="0" wp14:anchorId="7E4F2D65" wp14:editId="2549B48C">
+            <wp:extent cx="6637020" cy="3733800"/>
+            <wp:effectExtent l="0" t="0" r="0" b="0"/>
+            <wp:docPr id="1250700122" name="Picture 8"/>
             <wp:cNvGraphicFramePr>
               <a:graphicFrameLocks xmlns:a="http://schemas.openxmlformats.org/drawingml/2006/main" noChangeAspect="1"/>
             </wp:cNvGraphicFramePr>
@@ -9731,7 +9309,7 @@
               <a:graphicData uri="http://schemas.openxmlformats.org/drawingml/2006/picture">
                 <pic:pic xmlns:pic="http://schemas.openxmlformats.org/drawingml/2006/picture">
                   <pic:nvPicPr>
-                    <pic:cNvPr id="0" name="Picture 290"/>
+                    <pic:cNvPr id="0" name="Picture 8"/>
                     <pic:cNvPicPr>
                       <a:picLocks noChangeAspect="1" noChangeArrowheads="1"/>
                     </pic:cNvPicPr>
@@ -9752,7 +9330,7 @@
                   <pic:spPr bwMode="auto">
                     <a:xfrm>
                       <a:off x="0" y="0"/>
-                      <a:ext cx="6640195" cy="3526790"/>
+                      <a:ext cx="6637020" cy="3733800"/>
                     </a:xfrm>
                     <a:prstGeom prst="rect">
                       <a:avLst/>
@@ -9788,127 +9366,11 @@
           <w:rFonts w:ascii="Times New Roman" w:hAnsi="Times New Roman" w:cs="Times New Roman"/>
           <w:b/>
           <w:bCs/>
-          <w:sz w:val="32"/>
-          <w:szCs w:val="32"/>
-        </w:rPr>
-      </w:pPr>
-    </w:p>
-    <w:p>
-      <w:pPr>
-        <w:jc w:val="center"/>
-        <w:rPr>
-          <w:rFonts w:ascii="Times New Roman" w:hAnsi="Times New Roman" w:cs="Times New Roman"/>
-          <w:b/>
-          <w:bCs/>
-          <w:sz w:val="32"/>
-          <w:szCs w:val="32"/>
-        </w:rPr>
-      </w:pPr>
-    </w:p>
-    <w:p>
-      <w:pPr>
-        <w:jc w:val="center"/>
-        <w:rPr>
-          <w:rFonts w:ascii="Times New Roman" w:hAnsi="Times New Roman" w:cs="Times New Roman"/>
-          <w:b/>
-          <w:bCs/>
-          <w:sz w:val="32"/>
-          <w:szCs w:val="32"/>
-        </w:rPr>
-      </w:pPr>
-    </w:p>
-    <w:p>
-      <w:pPr>
-        <w:jc w:val="center"/>
-        <w:rPr>
-          <w:rFonts w:ascii="Times New Roman" w:hAnsi="Times New Roman" w:cs="Times New Roman"/>
-          <w:b/>
-          <w:bCs/>
-          <w:sz w:val="32"/>
-          <w:szCs w:val="32"/>
-        </w:rPr>
-      </w:pPr>
-      <w:r>
-        <w:rPr>
-          <w:rFonts w:ascii="Times New Roman" w:hAnsi="Times New Roman" w:cs="Times New Roman"/>
-          <w:b/>
-          <w:bCs/>
-          <w:sz w:val="32"/>
-          <w:szCs w:val="32"/>
-        </w:rPr>
-        <w:lastRenderedPageBreak/>
-        <w:t>23</w:t>
-      </w:r>
-    </w:p>
-    <w:p>
-      <w:pPr>
-        <w:jc w:val="center"/>
-        <w:rPr>
-          <w:rFonts w:ascii="Times New Roman" w:hAnsi="Times New Roman" w:cs="Times New Roman"/>
-          <w:b/>
-          <w:bCs/>
-          <w:sz w:val="32"/>
-          <w:szCs w:val="32"/>
-        </w:rPr>
-      </w:pPr>
-      <w:r>
-        <w:rPr>
-          <w:rFonts w:ascii="Times New Roman" w:hAnsi="Times New Roman" w:cs="Times New Roman"/>
-          <w:b/>
-          <w:bCs/>
           <w:noProof/>
           <w:sz w:val="32"/>
           <w:szCs w:val="32"/>
         </w:rPr>
-        <w:drawing>
-          <wp:inline distT="0" distB="0" distL="0" distR="0" wp14:anchorId="2E469673" wp14:editId="6B712D55">
-            <wp:extent cx="6640195" cy="3526790"/>
-            <wp:effectExtent l="0" t="0" r="8255" b="0"/>
-            <wp:docPr id="894445673" name="Picture 9"/>
-            <wp:cNvGraphicFramePr>
-              <a:graphicFrameLocks xmlns:a="http://schemas.openxmlformats.org/drawingml/2006/main" noChangeAspect="1"/>
-            </wp:cNvGraphicFramePr>
-            <a:graphic xmlns:a="http://schemas.openxmlformats.org/drawingml/2006/main">
-              <a:graphicData uri="http://schemas.openxmlformats.org/drawingml/2006/picture">
-                <pic:pic xmlns:pic="http://schemas.openxmlformats.org/drawingml/2006/picture">
-                  <pic:nvPicPr>
-                    <pic:cNvPr id="0" name="Picture 291"/>
-                    <pic:cNvPicPr>
-                      <a:picLocks noChangeAspect="1" noChangeArrowheads="1"/>
-                    </pic:cNvPicPr>
-                  </pic:nvPicPr>
-                  <pic:blipFill>
-                    <a:blip r:embed="rId26" cstate="print">
-                      <a:extLst>
-                        <a:ext uri="{28A0092B-C50C-407E-A947-70E740481C1C}">
-                          <a14:useLocalDpi xmlns:a14="http://schemas.microsoft.com/office/drawing/2010/main" val="0"/>
-                        </a:ext>
-                      </a:extLst>
-                    </a:blip>
-                    <a:srcRect/>
-                    <a:stretch>
-                      <a:fillRect/>
-                    </a:stretch>
-                  </pic:blipFill>
-                  <pic:spPr bwMode="auto">
-                    <a:xfrm>
-                      <a:off x="0" y="0"/>
-                      <a:ext cx="6640195" cy="3526790"/>
-                    </a:xfrm>
-                    <a:prstGeom prst="rect">
-                      <a:avLst/>
-                    </a:prstGeom>
-                    <a:noFill/>
-                    <a:ln>
-                      <a:noFill/>
-                    </a:ln>
-                  </pic:spPr>
-                </pic:pic>
-              </a:graphicData>
-            </a:graphic>
-          </wp:inline>
-        </w:drawing>
-      </w:r>
+      </w:pPr>
     </w:p>
     <w:p>
       <w:pPr>
@@ -9917,6 +9379,7 @@
           <w:rFonts w:ascii="Times New Roman" w:hAnsi="Times New Roman" w:cs="Times New Roman"/>
           <w:b/>
           <w:bCs/>
+          <w:noProof/>
           <w:sz w:val="32"/>
           <w:szCs w:val="32"/>
         </w:rPr>
@@ -9929,6 +9392,7 @@
           <w:rFonts w:ascii="Times New Roman" w:hAnsi="Times New Roman" w:cs="Times New Roman"/>
           <w:b/>
           <w:bCs/>
+          <w:noProof/>
           <w:sz w:val="32"/>
           <w:szCs w:val="32"/>
         </w:rPr>
@@ -9941,6 +9405,7 @@
           <w:rFonts w:ascii="Times New Roman" w:hAnsi="Times New Roman" w:cs="Times New Roman"/>
           <w:b/>
           <w:bCs/>
+          <w:noProof/>
           <w:sz w:val="32"/>
           <w:szCs w:val="32"/>
         </w:rPr>
@@ -9953,6 +9418,7 @@
           <w:rFonts w:ascii="Times New Roman" w:hAnsi="Times New Roman" w:cs="Times New Roman"/>
           <w:b/>
           <w:bCs/>
+          <w:noProof/>
           <w:sz w:val="32"/>
           <w:szCs w:val="32"/>
         </w:rPr>
@@ -9965,6 +9431,7 @@
           <w:rFonts w:ascii="Times New Roman" w:hAnsi="Times New Roman" w:cs="Times New Roman"/>
           <w:b/>
           <w:bCs/>
+          <w:noProof/>
           <w:sz w:val="32"/>
           <w:szCs w:val="32"/>
         </w:rPr>
@@ -9977,6 +9444,7 @@
           <w:rFonts w:ascii="Times New Roman" w:hAnsi="Times New Roman" w:cs="Times New Roman"/>
           <w:b/>
           <w:bCs/>
+          <w:noProof/>
           <w:sz w:val="32"/>
           <w:szCs w:val="32"/>
         </w:rPr>
@@ -9989,6 +9457,7 @@
           <w:rFonts w:ascii="Times New Roman" w:hAnsi="Times New Roman" w:cs="Times New Roman"/>
           <w:b/>
           <w:bCs/>
+          <w:noProof/>
           <w:sz w:val="32"/>
           <w:szCs w:val="32"/>
         </w:rPr>
@@ -10001,6 +9470,7 @@
           <w:rFonts w:ascii="Times New Roman" w:hAnsi="Times New Roman" w:cs="Times New Roman"/>
           <w:b/>
           <w:bCs/>
+          <w:noProof/>
           <w:sz w:val="32"/>
           <w:szCs w:val="32"/>
         </w:rPr>
@@ -10077,10 +9547,7 @@
           <w:szCs w:val="32"/>
         </w:rPr>
       </w:pPr>
-    </w:p>
-    <w:p>
-      <w:pPr>
-        <w:jc w:val="center"/>
+      <w:r>
         <w:rPr>
           <w:rFonts w:ascii="Times New Roman" w:hAnsi="Times New Roman" w:cs="Times New Roman"/>
           <w:b/>
@@ -10088,7 +9555,9 @@
           <w:sz w:val="32"/>
           <w:szCs w:val="32"/>
         </w:rPr>
-      </w:pPr>
+        <w:lastRenderedPageBreak/>
+        <w:t>24</w:t>
+      </w:r>
     </w:p>
     <w:p>
       <w:pPr>
@@ -10109,29 +9578,6 @@
           <w:sz w:val="32"/>
           <w:szCs w:val="32"/>
         </w:rPr>
-        <w:lastRenderedPageBreak/>
-        <w:t>24</w:t>
-      </w:r>
-    </w:p>
-    <w:p>
-      <w:pPr>
-        <w:jc w:val="center"/>
-        <w:rPr>
-          <w:rFonts w:ascii="Times New Roman" w:hAnsi="Times New Roman" w:cs="Times New Roman"/>
-          <w:b/>
-          <w:bCs/>
-          <w:sz w:val="32"/>
-          <w:szCs w:val="32"/>
-        </w:rPr>
-      </w:pPr>
-      <w:r>
-        <w:rPr>
-          <w:rFonts w:ascii="Times New Roman" w:hAnsi="Times New Roman" w:cs="Times New Roman"/>
-          <w:b/>
-          <w:bCs/>
-          <w:sz w:val="32"/>
-          <w:szCs w:val="32"/>
-        </w:rPr>
         <w:t>CONCLUSION</w:t>
       </w:r>
     </w:p>
@@ -10144,23 +9590,13 @@
           <w:szCs w:val="28"/>
         </w:rPr>
       </w:pPr>
-      <w:proofErr w:type="spellStart"/>
-      <w:r>
-        <w:rPr>
-          <w:rFonts w:ascii="Times New Roman" w:hAnsi="Times New Roman" w:cs="Times New Roman"/>
-          <w:sz w:val="28"/>
-          <w:szCs w:val="28"/>
-        </w:rPr>
-        <w:t>CreditPath</w:t>
-      </w:r>
-      <w:proofErr w:type="spellEnd"/>
-      <w:r>
-        <w:rPr>
-          <w:rFonts w:ascii="Times New Roman" w:hAnsi="Times New Roman" w:cs="Times New Roman"/>
-          <w:sz w:val="28"/>
-          <w:szCs w:val="28"/>
-        </w:rPr>
-        <w:t xml:space="preserve"> AI successfully demonstrates the development of an intelligent and efficient loan risk prediction system. The project integrates backend processing, frontend visualization, and recommendation logic to provide a complete solution for financial decision-making.</w:t>
+      <w:r>
+        <w:rPr>
+          <w:rFonts w:ascii="Times New Roman" w:hAnsi="Times New Roman" w:cs="Times New Roman"/>
+          <w:sz w:val="28"/>
+          <w:szCs w:val="28"/>
+        </w:rPr>
+        <w:t>CreditPath AI successfully demonstrates the development of an intelligent and efficient loan risk prediction system. The project integrates backend processing, frontend visualization, and recommendation logic to provide a complete solution for financial decision-making.</w:t>
       </w:r>
     </w:p>
     <w:p>
@@ -10232,31 +9668,13 @@
           <w:sz w:val="28"/>
           <w:szCs w:val="28"/>
         </w:rPr>
-        <w:t xml:space="preserve">In conclusion, </w:t>
-      </w:r>
-      <w:proofErr w:type="spellStart"/>
-      <w:r>
-        <w:rPr>
-          <w:rFonts w:ascii="Times New Roman" w:hAnsi="Times New Roman" w:cs="Times New Roman"/>
-          <w:sz w:val="28"/>
-          <w:szCs w:val="28"/>
-        </w:rPr>
-        <w:t>CreditPath</w:t>
-      </w:r>
-      <w:proofErr w:type="spellEnd"/>
-      <w:r>
-        <w:rPr>
-          <w:rFonts w:ascii="Times New Roman" w:hAnsi="Times New Roman" w:cs="Times New Roman"/>
-          <w:sz w:val="28"/>
-          <w:szCs w:val="28"/>
-        </w:rPr>
-        <w:t xml:space="preserve"> AI represents a significant step towards intelligent financial systems and demonstrates how technology can be used to improve decision-making in the banking sector.</w:t>
+        <w:t>In conclusion, CreditPath AI represents a significant step towards intelligent financial systems and demonstrates how technology can be used to improve decision-making in the banking sector.</w:t>
       </w:r>
     </w:p>
     <w:p/>
     <w:p/>
     <w:sectPr>
-      <w:footerReference w:type="default" r:id="rId27"/>
+      <w:footerReference w:type="default" r:id="rId26"/>
       <w:pgSz w:w="11906" w:h="16838"/>
       <w:pgMar w:top="720" w:right="720" w:bottom="720" w:left="720" w:header="708" w:footer="708" w:gutter="0"/>
       <w:pgBorders w:offsetFrom="page">
@@ -13475,6 +12893,7 @@
   <w:style w:type="character" w:default="1" w:styleId="DefaultParagraphFont">
     <w:name w:val="Default Paragraph Font"/>
     <w:uiPriority w:val="1"/>
+    <w:semiHidden/>
     <w:unhideWhenUsed/>
   </w:style>
   <w:style w:type="table" w:default="1" w:styleId="TableNormal">

</xml_diff>